<commit_message>
Added explicit instructions re academic integrity and using Generative AI or re-using materials from a previous term.
</commit_message>
<xml_diff>
--- a/202630/Syllabus/Syllabus-202630.docx
+++ b/202630/Syllabus/Syllabus-202630.docx
@@ -4,7 +4,7 @@
   <w:body>
     <w:p>
       <w:pPr>
-        <w:spacing w:before="120" w:line="252" w:lineRule="auto"/>
+        <w:spacing w:before="120"/>
         <w:jc w:val="center"/>
         <w:outlineLvl w:val="1"/>
         <w:rPr>
@@ -107,7 +107,7 @@
     </w:p>
     <w:p>
       <w:pPr>
-        <w:spacing w:before="120" w:line="252" w:lineRule="auto"/>
+        <w:spacing w:before="120"/>
         <w:outlineLvl w:val="1"/>
         <w:rPr>
           <w:rFonts w:asciiTheme="minorHAnsi" w:hAnsiTheme="minorHAnsi"/>
@@ -124,7 +124,7 @@
     </w:p>
     <w:p>
       <w:pPr>
-        <w:spacing w:before="120" w:line="252" w:lineRule="auto"/>
+        <w:spacing w:before="120"/>
         <w:ind w:left="-432" w:right="-576"/>
         <w:outlineLvl w:val="1"/>
         <w:rPr>
@@ -210,7 +210,7 @@
     </w:p>
     <w:p>
       <w:pPr>
-        <w:spacing w:before="120" w:line="252" w:lineRule="auto"/>
+        <w:spacing w:before="120"/>
         <w:ind w:left="-432" w:right="-720"/>
         <w:outlineLvl w:val="1"/>
         <w:rPr>
@@ -283,7 +283,7 @@
     </w:p>
     <w:p>
       <w:pPr>
-        <w:spacing w:before="120" w:line="252" w:lineRule="auto"/>
+        <w:spacing w:before="120"/>
         <w:ind w:right="-576"/>
         <w:outlineLvl w:val="1"/>
         <w:rPr>
@@ -328,7 +328,7 @@
     </w:p>
     <w:p>
       <w:pPr>
-        <w:spacing w:before="120" w:line="252" w:lineRule="auto"/>
+        <w:spacing w:before="120"/>
         <w:rPr>
           <w:rFonts w:asciiTheme="minorHAnsi" w:hAnsiTheme="minorHAnsi"/>
           <w:color w:val="000000"/>
@@ -356,7 +356,7 @@
     </w:p>
     <w:p>
       <w:pPr>
-        <w:spacing w:before="120" w:line="252" w:lineRule="auto"/>
+        <w:spacing w:before="120"/>
         <w:rPr>
           <w:rFonts w:asciiTheme="minorHAnsi" w:hAnsiTheme="minorHAnsi"/>
           <w:color w:val="000000"/>
@@ -379,7 +379,7 @@
     </w:p>
     <w:p>
       <w:pPr>
-        <w:spacing w:before="120" w:line="252" w:lineRule="auto"/>
+        <w:spacing w:before="120"/>
         <w:rPr>
           <w:rFonts w:asciiTheme="minorHAnsi" w:hAnsiTheme="minorHAnsi"/>
           <w:b/>
@@ -399,7 +399,7 @@
     </w:p>
     <w:p>
       <w:pPr>
-        <w:spacing w:before="120" w:line="252" w:lineRule="auto"/>
+        <w:spacing w:before="120"/>
         <w:rPr>
           <w:rFonts w:asciiTheme="minorHAnsi" w:hAnsiTheme="minorHAnsi"/>
           <w:color w:val="000000"/>
@@ -447,7 +447,7 @@
     </w:p>
     <w:p>
       <w:pPr>
-        <w:spacing w:before="120" w:line="252" w:lineRule="auto"/>
+        <w:spacing w:before="120"/>
         <w:rPr>
           <w:rFonts w:asciiTheme="minorHAnsi" w:hAnsiTheme="minorHAnsi"/>
           <w:color w:val="000000"/>
@@ -555,6 +555,19 @@
                 <w:rFonts w:asciiTheme="minorHAnsi" w:hAnsiTheme="minorHAnsi" w:cstheme="minorHAnsi"/>
                 <w:color w:val="000000"/>
               </w:rPr>
+            </w:pPr>
+            <w:r>
+              <w:rPr>
+                <w:rFonts w:asciiTheme="minorHAnsi" w:hAnsiTheme="minorHAnsi" w:cstheme="minorHAnsi"/>
+                <w:color w:val="000000"/>
+              </w:rPr>
+              <w:t>Office hours:  In Microsoft Teams most times from 9 a.m. to 7 p.m., seven days a week</w:t>
+            </w:r>
+          </w:p>
+          <w:p>
+            <w:pPr>
+              <w:spacing w:before="120"/>
+              <w:jc w:val="center"/>
             </w:pPr>
             <w:hyperlink r:id="rId8" w:history="1">
               <w:r>
@@ -658,6 +671,7 @@
       <w:pPr>
         <w:pStyle w:val="Heading1"/>
         <w:spacing w:before="120"/>
+        <w:contextualSpacing/>
         <w:rPr>
           <w:rFonts w:asciiTheme="minorHAnsi" w:eastAsia="Times New Roman" w:hAnsiTheme="minorHAnsi"/>
           <w:b/>
@@ -669,8 +683,6 @@
           <w:highlight w:val="yellow"/>
         </w:rPr>
       </w:pPr>
-      <w:bookmarkStart w:id="4" w:name="_Academic_Integrity"/>
-      <w:bookmarkEnd w:id="4"/>
       <w:r>
         <w:rPr>
           <w:rFonts w:asciiTheme="minorHAnsi" w:eastAsia="Times New Roman" w:hAnsiTheme="minorHAnsi"/>
@@ -727,7 +739,7 @@
     </w:p>
     <w:p>
       <w:pPr>
-        <w:spacing w:before="120" w:line="252" w:lineRule="auto"/>
+        <w:spacing w:before="120"/>
         <w:rPr>
           <w:rFonts w:asciiTheme="minorHAnsi" w:hAnsiTheme="minorHAnsi"/>
           <w:color w:val="000000"/>
@@ -754,7 +766,7 @@
     </w:p>
     <w:p>
       <w:pPr>
-        <w:spacing w:before="120" w:line="252" w:lineRule="auto"/>
+        <w:spacing w:before="120"/>
         <w:jc w:val="center"/>
         <w:rPr>
           <w:rFonts w:asciiTheme="minorHAnsi" w:hAnsiTheme="minorHAnsi"/>
@@ -794,7 +806,7 @@
     </w:p>
     <w:p>
       <w:pPr>
-        <w:spacing w:before="120" w:line="252" w:lineRule="auto"/>
+        <w:spacing w:before="120"/>
         <w:rPr>
           <w:rFonts w:asciiTheme="minorHAnsi" w:hAnsiTheme="minorHAnsi"/>
           <w:color w:val="000000"/>
@@ -878,7 +890,7 @@
     </w:p>
     <w:p>
       <w:pPr>
-        <w:spacing w:before="120" w:line="252" w:lineRule="auto"/>
+        <w:spacing w:before="120"/>
         <w:rPr>
           <w:rFonts w:asciiTheme="minorHAnsi" w:hAnsiTheme="minorHAnsi"/>
           <w:color w:val="000000"/>
@@ -924,16 +936,7 @@
     </w:p>
     <w:p>
       <w:pPr>
-        <w:spacing w:before="120" w:line="252" w:lineRule="auto"/>
-        <w:rPr>
-          <w:rFonts w:asciiTheme="minorHAnsi" w:hAnsiTheme="minorHAnsi"/>
-          <w:color w:val="000000"/>
-        </w:rPr>
-      </w:pPr>
-    </w:p>
-    <w:p>
-      <w:pPr>
-        <w:spacing w:before="120" w:line="252" w:lineRule="auto"/>
+        <w:spacing w:before="240" w:line="252" w:lineRule="auto"/>
         <w:rPr>
           <w:rFonts w:asciiTheme="minorHAnsi" w:hAnsiTheme="minorHAnsi"/>
           <w:color w:val="000000"/>
@@ -949,7 +952,7 @@
     </w:p>
     <w:p>
       <w:pPr>
-        <w:spacing w:before="120" w:line="252" w:lineRule="auto"/>
+        <w:spacing w:before="120"/>
         <w:ind w:left="720" w:right="-576"/>
         <w:rPr>
           <w:rFonts w:asciiTheme="minorHAnsi" w:hAnsiTheme="minorHAnsi"/>
@@ -975,7 +978,7 @@
     </w:p>
     <w:p>
       <w:pPr>
-        <w:spacing w:before="120" w:line="252" w:lineRule="auto"/>
+        <w:spacing w:before="120"/>
         <w:ind w:left="720" w:right="-576"/>
         <w:rPr>
           <w:rFonts w:asciiTheme="minorHAnsi" w:hAnsiTheme="minorHAnsi"/>
@@ -1011,21 +1014,7 @@
             <w:rStyle w:val="Hyperlink"/>
             <w:rFonts w:asciiTheme="minorHAnsi" w:hAnsiTheme="minorHAnsi"/>
           </w:rPr>
-          <w:t>What Constit</w:t>
-        </w:r>
-        <w:r>
-          <w:rPr>
-            <w:rStyle w:val="Hyperlink"/>
-            <w:rFonts w:asciiTheme="minorHAnsi" w:hAnsiTheme="minorHAnsi"/>
-          </w:rPr>
-          <w:t>u</w:t>
-        </w:r>
-        <w:r>
-          <w:rPr>
-            <w:rStyle w:val="Hyperlink"/>
-            <w:rFonts w:asciiTheme="minorHAnsi" w:hAnsiTheme="minorHAnsi"/>
-          </w:rPr>
-          <w:t>tes Misconduct</w:t>
+          <w:t>What Constitutes Misconduct</w:t>
         </w:r>
       </w:hyperlink>
       <w:r>
@@ -1038,7 +1027,7 @@
     </w:p>
     <w:p>
       <w:pPr>
-        <w:spacing w:before="120" w:line="252" w:lineRule="auto"/>
+        <w:spacing w:before="120"/>
         <w:ind w:left="720" w:right="-576"/>
         <w:rPr>
           <w:rFonts w:asciiTheme="minorHAnsi" w:hAnsiTheme="minorHAnsi"/>
@@ -1186,18 +1175,7 @@
     </w:p>
     <w:p>
       <w:pPr>
-        <w:spacing w:before="120" w:line="252" w:lineRule="auto"/>
-        <w:rPr>
-          <w:rFonts w:asciiTheme="minorHAnsi" w:hAnsiTheme="minorHAnsi"/>
-          <w:b/>
-          <w:bCs/>
-          <w:color w:val="000000"/>
-        </w:rPr>
-      </w:pPr>
-    </w:p>
-    <w:p>
-      <w:pPr>
-        <w:spacing w:before="120" w:line="252" w:lineRule="auto"/>
+        <w:spacing w:before="240" w:line="252" w:lineRule="auto"/>
         <w:rPr>
           <w:rFonts w:asciiTheme="minorHAnsi" w:hAnsiTheme="minorHAnsi"/>
           <w:color w:val="000000"/>
@@ -1226,6 +1204,7 @@
     </w:p>
     <w:p>
       <w:pPr>
+        <w:spacing w:before="120"/>
         <w:rPr>
           <w:rFonts w:asciiTheme="minorHAnsi" w:hAnsiTheme="minorHAnsi"/>
           <w:b/>
@@ -1235,9 +1214,7 @@
           <w:color w:val="000000"/>
         </w:rPr>
       </w:pPr>
-    </w:p>
-    <w:p>
-      <w:pPr>
+      <w:r>
         <w:rPr>
           <w:rFonts w:asciiTheme="minorHAnsi" w:hAnsiTheme="minorHAnsi"/>
           <w:b/>
@@ -1246,7 +1223,66 @@
           <w:iCs/>
           <w:color w:val="000000"/>
         </w:rPr>
-      </w:pPr>
+        <w:t>Exams</w:t>
+      </w:r>
+      <w:r>
+        <w:rPr>
+          <w:rFonts w:asciiTheme="minorHAnsi" w:hAnsiTheme="minorHAnsi"/>
+          <w:color w:val="000000"/>
+        </w:rPr>
+        <w:t xml:space="preserve"> are to be done INDIVIDUALLY, with NO COMMUNICATION with anyone other than your instructor and </w:t>
+      </w:r>
+      <w:r>
+        <w:rPr>
+          <w:rFonts w:asciiTheme="minorHAnsi" w:hAnsiTheme="minorHAnsi"/>
+          <w:color w:val="000000"/>
+        </w:rPr>
+        <w:t>their</w:t>
+      </w:r>
+      <w:r>
+        <w:rPr>
+          <w:rFonts w:asciiTheme="minorHAnsi" w:hAnsiTheme="minorHAnsi"/>
+          <w:color w:val="000000"/>
+        </w:rPr>
+        <w:t xml:space="preserve"> delegates. Each exam will have explicit rules for what </w:t>
+      </w:r>
+      <w:r>
+        <w:rPr>
+          <w:rFonts w:asciiTheme="minorHAnsi" w:hAnsiTheme="minorHAnsi"/>
+          <w:color w:val="000000"/>
+        </w:rPr>
+        <w:t>external</w:t>
+      </w:r>
+      <w:r>
+        <w:rPr>
+          <w:rFonts w:asciiTheme="minorHAnsi" w:hAnsiTheme="minorHAnsi"/>
+          <w:color w:val="000000"/>
+        </w:rPr>
+        <w:t xml:space="preserve"> resources you may use for what parts of the exam</w:t>
+      </w:r>
+      <w:r>
+        <w:rPr>
+          <w:rFonts w:asciiTheme="minorHAnsi" w:hAnsiTheme="minorHAnsi"/>
+          <w:color w:val="000000"/>
+        </w:rPr>
+        <w:t>.</w:t>
+      </w:r>
+    </w:p>
+    <w:p>
+      <w:pPr>
+        <w:spacing w:before="120"/>
+        <w:rPr>
+          <w:rFonts w:asciiTheme="minorHAnsi" w:hAnsiTheme="minorHAnsi"/>
+          <w:color w:val="000000"/>
+        </w:rPr>
+      </w:pPr>
+      <w:r>
+        <w:rPr>
+          <w:rFonts w:asciiTheme="minorHAnsi" w:hAnsiTheme="minorHAnsi"/>
+          <w:color w:val="000000"/>
+        </w:rPr>
+        <w:t xml:space="preserve">For </w:t>
+      </w:r>
       <w:r>
         <w:rPr>
           <w:rFonts w:asciiTheme="minorHAnsi" w:hAnsiTheme="minorHAnsi"/>
@@ -1256,75 +1292,6 @@
           <w:iCs/>
           <w:color w:val="000000"/>
         </w:rPr>
-        <w:t>Exams</w:t>
-      </w:r>
-      <w:r>
-        <w:rPr>
-          <w:rFonts w:asciiTheme="minorHAnsi" w:hAnsiTheme="minorHAnsi"/>
-          <w:color w:val="000000"/>
-        </w:rPr>
-        <w:t xml:space="preserve"> are to be done INDIVIDUALLY, with NO COMMUNICATION with anyone other than your instructor and </w:t>
-      </w:r>
-      <w:r>
-        <w:rPr>
-          <w:rFonts w:asciiTheme="minorHAnsi" w:hAnsiTheme="minorHAnsi"/>
-          <w:color w:val="000000"/>
-        </w:rPr>
-        <w:t>their</w:t>
-      </w:r>
-      <w:r>
-        <w:rPr>
-          <w:rFonts w:asciiTheme="minorHAnsi" w:hAnsiTheme="minorHAnsi"/>
-          <w:color w:val="000000"/>
-        </w:rPr>
-        <w:t xml:space="preserve"> delegates. Each exam will have explicit rules for what </w:t>
-      </w:r>
-      <w:r>
-        <w:rPr>
-          <w:rFonts w:asciiTheme="minorHAnsi" w:hAnsiTheme="minorHAnsi"/>
-          <w:color w:val="000000"/>
-        </w:rPr>
-        <w:t>external</w:t>
-      </w:r>
-      <w:r>
-        <w:rPr>
-          <w:rFonts w:asciiTheme="minorHAnsi" w:hAnsiTheme="minorHAnsi"/>
-          <w:color w:val="000000"/>
-        </w:rPr>
-        <w:t xml:space="preserve"> resources you may use for what parts of the exam</w:t>
-      </w:r>
-      <w:r>
-        <w:rPr>
-          <w:rFonts w:asciiTheme="minorHAnsi" w:hAnsiTheme="minorHAnsi"/>
-          <w:color w:val="000000"/>
-        </w:rPr>
-        <w:t>.</w:t>
-      </w:r>
-    </w:p>
-    <w:p>
-      <w:pPr>
-        <w:spacing w:before="120" w:line="252" w:lineRule="auto"/>
-        <w:rPr>
-          <w:rFonts w:asciiTheme="minorHAnsi" w:hAnsiTheme="minorHAnsi"/>
-          <w:color w:val="000000"/>
-        </w:rPr>
-      </w:pPr>
-      <w:r>
-        <w:rPr>
-          <w:rFonts w:asciiTheme="minorHAnsi" w:hAnsiTheme="minorHAnsi"/>
-          <w:color w:val="000000"/>
-        </w:rPr>
-        <w:t xml:space="preserve">For </w:t>
-      </w:r>
-      <w:r>
-        <w:rPr>
-          <w:rFonts w:asciiTheme="minorHAnsi" w:hAnsiTheme="minorHAnsi"/>
-          <w:b/>
-          <w:bCs/>
-          <w:i/>
-          <w:iCs/>
-          <w:color w:val="000000"/>
-        </w:rPr>
         <w:t>all work other than exams</w:t>
       </w:r>
       <w:r>
@@ -1332,7 +1299,7 @@
           <w:rFonts w:asciiTheme="minorHAnsi" w:hAnsiTheme="minorHAnsi"/>
           <w:color w:val="000000"/>
         </w:rPr>
-        <w:t xml:space="preserve">, getting help and working with others is encouraged. Just follow these three rules for all work that you turn in as your own: </w:t>
+        <w:t xml:space="preserve">, getting help and working with others is encouraged. Just follow these rules for all work that you turn in as your own: </w:t>
       </w:r>
     </w:p>
     <w:p>
@@ -1342,7 +1309,7 @@
           <w:ilvl w:val="0"/>
           <w:numId w:val="7"/>
         </w:numPr>
-        <w:spacing w:before="120" w:line="252" w:lineRule="auto"/>
+        <w:spacing w:before="120"/>
         <w:ind w:left="576"/>
         <w:contextualSpacing w:val="0"/>
         <w:rPr>
@@ -1402,7 +1369,7 @@
     <w:p>
       <w:pPr>
         <w:pStyle w:val="ListParagraph"/>
-        <w:spacing w:before="120" w:line="252" w:lineRule="auto"/>
+        <w:spacing w:before="120"/>
         <w:ind w:left="576"/>
         <w:contextualSpacing w:val="0"/>
         <w:jc w:val="center"/>
@@ -1426,7 +1393,7 @@
     <w:p>
       <w:pPr>
         <w:pStyle w:val="ListParagraph"/>
-        <w:spacing w:before="120" w:line="252" w:lineRule="auto"/>
+        <w:spacing w:before="120"/>
         <w:contextualSpacing w:val="0"/>
         <w:rPr>
           <w:rFonts w:asciiTheme="minorHAnsi" w:hAnsiTheme="minorHAnsi"/>
@@ -1444,7 +1411,7 @@
     <w:p>
       <w:pPr>
         <w:pStyle w:val="ListParagraph"/>
-        <w:spacing w:before="120" w:line="252" w:lineRule="auto"/>
+        <w:spacing w:before="120"/>
         <w:contextualSpacing w:val="0"/>
         <w:rPr>
           <w:rFonts w:asciiTheme="minorHAnsi" w:hAnsiTheme="minorHAnsi"/>
@@ -1456,14 +1423,13 @@
           <w:rFonts w:asciiTheme="minorHAnsi" w:hAnsiTheme="minorHAnsi"/>
           <w:color w:val="000000"/>
         </w:rPr>
-        <w:lastRenderedPageBreak/>
         <w:t>Exception to Rule 1:  You may use any solution that your professor supplies, e.g. from a video, in Live Coding, on a whiteboard, or sending it to you directly.</w:t>
       </w:r>
     </w:p>
     <w:p>
       <w:pPr>
         <w:pStyle w:val="ListParagraph"/>
-        <w:spacing w:before="120" w:line="252" w:lineRule="auto"/>
+        <w:spacing w:before="120"/>
         <w:contextualSpacing w:val="0"/>
         <w:rPr>
           <w:rFonts w:asciiTheme="minorHAnsi" w:hAnsiTheme="minorHAnsi"/>
@@ -1492,201 +1458,6 @@
           <w:color w:val="000000"/>
         </w:rPr>
         <w:t xml:space="preserve"> (IDE), PyCharm, auto-completes what you type with suggestions that you may accept.</w:t>
-      </w:r>
-    </w:p>
-    <w:p>
-      <w:pPr>
-        <w:pStyle w:val="ListParagraph"/>
-        <w:spacing w:before="120" w:line="252" w:lineRule="auto"/>
-        <w:contextualSpacing w:val="0"/>
-        <w:rPr>
-          <w:rFonts w:asciiTheme="minorHAnsi" w:hAnsiTheme="minorHAnsi"/>
-          <w:color w:val="000000"/>
-        </w:rPr>
-      </w:pPr>
-      <w:r>
-        <w:rPr>
-          <w:rFonts w:asciiTheme="minorHAnsi" w:hAnsiTheme="minorHAnsi"/>
-          <w:color w:val="000000"/>
-        </w:rPr>
-        <w:t>Re PyCharm/</w:t>
-      </w:r>
-      <w:proofErr w:type="spellStart"/>
-      <w:r>
-        <w:rPr>
-          <w:rFonts w:asciiTheme="minorHAnsi" w:hAnsiTheme="minorHAnsi"/>
-          <w:color w:val="000000"/>
-        </w:rPr>
-        <w:t>JetBrain’s</w:t>
-      </w:r>
-      <w:proofErr w:type="spellEnd"/>
-      <w:r>
-        <w:rPr>
-          <w:rFonts w:asciiTheme="minorHAnsi" w:hAnsiTheme="minorHAnsi"/>
-          <w:color w:val="000000"/>
-        </w:rPr>
-        <w:t xml:space="preserve"> optional </w:t>
-      </w:r>
-      <w:r>
-        <w:rPr>
-          <w:rFonts w:asciiTheme="minorHAnsi" w:hAnsiTheme="minorHAnsi"/>
-          <w:b/>
-          <w:bCs/>
-          <w:color w:val="000000"/>
-        </w:rPr>
-        <w:t>Intelligent AI</w:t>
-      </w:r>
-      <w:r>
-        <w:rPr>
-          <w:rFonts w:asciiTheme="minorHAnsi" w:hAnsiTheme="minorHAnsi"/>
-          <w:color w:val="000000"/>
-        </w:rPr>
-        <w:t xml:space="preserve">, </w:t>
-      </w:r>
-      <w:r>
-        <w:rPr>
-          <w:rFonts w:asciiTheme="minorHAnsi" w:hAnsiTheme="minorHAnsi"/>
-          <w:b/>
-          <w:bCs/>
-          <w:color w:val="000000"/>
-        </w:rPr>
-        <w:t>ChatGPT</w:t>
-      </w:r>
-      <w:r>
-        <w:rPr>
-          <w:rFonts w:asciiTheme="minorHAnsi" w:hAnsiTheme="minorHAnsi"/>
-          <w:color w:val="000000"/>
-        </w:rPr>
-        <w:t xml:space="preserve">, and other </w:t>
-      </w:r>
-      <w:r>
-        <w:rPr>
-          <w:rFonts w:asciiTheme="minorHAnsi" w:hAnsiTheme="minorHAnsi"/>
-          <w:b/>
-          <w:bCs/>
-          <w:color w:val="000000"/>
-        </w:rPr>
-        <w:t>Large Language Models</w:t>
-      </w:r>
-      <w:r>
-        <w:rPr>
-          <w:rFonts w:asciiTheme="minorHAnsi" w:hAnsiTheme="minorHAnsi"/>
-          <w:color w:val="000000"/>
-        </w:rPr>
-        <w:t xml:space="preserve"> (LLMs</w:t>
-      </w:r>
-      <w:r>
-        <w:rPr>
-          <w:rFonts w:asciiTheme="minorHAnsi" w:hAnsiTheme="minorHAnsi"/>
-          <w:color w:val="000000"/>
-        </w:rPr>
-        <w:t xml:space="preserve">), </w:t>
-      </w:r>
-      <w:r>
-        <w:rPr>
-          <w:rFonts w:asciiTheme="minorHAnsi" w:hAnsiTheme="minorHAnsi"/>
-          <w:b/>
-          <w:bCs/>
-          <w:color w:val="000000"/>
-        </w:rPr>
-        <w:t xml:space="preserve">you </w:t>
-      </w:r>
-      <w:r>
-        <w:rPr>
-          <w:rFonts w:asciiTheme="minorHAnsi" w:hAnsiTheme="minorHAnsi"/>
-          <w:b/>
-          <w:bCs/>
-          <w:color w:val="000000"/>
-        </w:rPr>
-        <w:t>are NOT</w:t>
-      </w:r>
-      <w:r>
-        <w:rPr>
-          <w:rFonts w:asciiTheme="minorHAnsi" w:hAnsiTheme="minorHAnsi"/>
-          <w:b/>
-          <w:bCs/>
-          <w:color w:val="000000"/>
-        </w:rPr>
-        <w:t xml:space="preserve"> permitted to use these</w:t>
-      </w:r>
-      <w:r>
-        <w:rPr>
-          <w:rFonts w:asciiTheme="minorHAnsi" w:hAnsiTheme="minorHAnsi"/>
-          <w:color w:val="000000"/>
-        </w:rPr>
-        <w:t xml:space="preserve"> in our sections of CSSE 120 (</w:t>
-      </w:r>
-      <w:r>
-        <w:rPr>
-          <w:rFonts w:asciiTheme="minorHAnsi" w:hAnsiTheme="minorHAnsi"/>
-          <w:color w:val="000000"/>
-        </w:rPr>
-        <w:t>nor</w:t>
-      </w:r>
-      <w:r>
-        <w:rPr>
-          <w:rFonts w:asciiTheme="minorHAnsi" w:hAnsiTheme="minorHAnsi"/>
-          <w:color w:val="000000"/>
-        </w:rPr>
-        <w:t xml:space="preserve"> in other CSSE </w:t>
-      </w:r>
-      <w:r>
-        <w:rPr>
-          <w:rFonts w:asciiTheme="minorHAnsi" w:hAnsiTheme="minorHAnsi"/>
-          <w:color w:val="000000"/>
-        </w:rPr>
-        <w:t>120 sections</w:t>
-      </w:r>
-      <w:r>
-        <w:rPr>
-          <w:rFonts w:asciiTheme="minorHAnsi" w:hAnsiTheme="minorHAnsi"/>
-          <w:color w:val="000000"/>
-        </w:rPr>
-        <w:t>) for coding</w:t>
-      </w:r>
-      <w:r>
-        <w:rPr>
-          <w:rFonts w:asciiTheme="minorHAnsi" w:hAnsiTheme="minorHAnsi"/>
-          <w:color w:val="000000"/>
-        </w:rPr>
-        <w:t>, except possibly as directed by your instructor for the Capstone Project.</w:t>
-      </w:r>
-      <w:r>
-        <w:rPr>
-          <w:rFonts w:asciiTheme="minorHAnsi" w:hAnsiTheme="minorHAnsi"/>
-          <w:color w:val="000000"/>
-        </w:rPr>
-        <w:t xml:space="preserve"> </w:t>
-      </w:r>
-      <w:r>
-        <w:rPr>
-          <w:rFonts w:asciiTheme="minorHAnsi" w:hAnsiTheme="minorHAnsi"/>
-          <w:color w:val="000000"/>
-        </w:rPr>
-        <w:t xml:space="preserve"> </w:t>
-      </w:r>
-      <w:r>
-        <w:rPr>
-          <w:rFonts w:asciiTheme="minorHAnsi" w:hAnsiTheme="minorHAnsi"/>
-          <w:color w:val="000000"/>
-        </w:rPr>
-        <w:t xml:space="preserve">You </w:t>
-      </w:r>
-      <w:proofErr w:type="gramStart"/>
-      <w:r>
-        <w:rPr>
-          <w:rFonts w:asciiTheme="minorHAnsi" w:hAnsiTheme="minorHAnsi"/>
-          <w:color w:val="000000"/>
-        </w:rPr>
-        <w:t>have to</w:t>
-      </w:r>
-      <w:proofErr w:type="gramEnd"/>
-      <w:r>
-        <w:rPr>
-          <w:rFonts w:asciiTheme="minorHAnsi" w:hAnsiTheme="minorHAnsi"/>
-          <w:color w:val="000000"/>
-        </w:rPr>
-        <w:t xml:space="preserve"> learn how to walk before running; they are great tools, but for students ready to run.</w:t>
       </w:r>
     </w:p>
     <w:p>
@@ -1696,7 +1467,7 @@
           <w:ilvl w:val="0"/>
           <w:numId w:val="7"/>
         </w:numPr>
-        <w:spacing w:before="120" w:line="252" w:lineRule="auto"/>
+        <w:spacing w:before="120"/>
         <w:ind w:left="576"/>
         <w:contextualSpacing w:val="0"/>
         <w:rPr>
@@ -1713,6 +1484,7 @@
           <w:bCs/>
           <w:color w:val="000000"/>
         </w:rPr>
+        <w:lastRenderedPageBreak/>
         <w:t xml:space="preserve">Rule 2: </w:t>
       </w:r>
       <w:r>
@@ -1757,7 +1529,7 @@
     <w:p>
       <w:pPr>
         <w:pStyle w:val="ListParagraph"/>
-        <w:spacing w:before="120" w:line="252" w:lineRule="auto"/>
+        <w:spacing w:before="120"/>
         <w:contextualSpacing w:val="0"/>
         <w:rPr>
           <w:rFonts w:asciiTheme="minorHAnsi" w:hAnsiTheme="minorHAnsi"/>
@@ -1789,7 +1561,7 @@
     <w:p>
       <w:pPr>
         <w:pStyle w:val="ListParagraph"/>
-        <w:spacing w:before="120" w:line="252" w:lineRule="auto"/>
+        <w:spacing w:before="120"/>
         <w:contextualSpacing w:val="0"/>
         <w:rPr>
           <w:rFonts w:asciiTheme="minorHAnsi" w:hAnsiTheme="minorHAnsi"/>
@@ -1811,7 +1583,7 @@
           <w:ilvl w:val="0"/>
           <w:numId w:val="7"/>
         </w:numPr>
-        <w:spacing w:before="120" w:line="252" w:lineRule="auto"/>
+        <w:spacing w:before="120"/>
         <w:ind w:left="576"/>
         <w:contextualSpacing w:val="0"/>
         <w:rPr>
@@ -1872,7 +1644,7 @@
           <w:ilvl w:val="1"/>
           <w:numId w:val="7"/>
         </w:numPr>
-        <w:spacing w:before="120" w:line="252" w:lineRule="auto"/>
+        <w:spacing w:before="120"/>
         <w:ind w:left="1080"/>
         <w:contextualSpacing w:val="0"/>
         <w:rPr>
@@ -1899,7 +1671,7 @@
     <w:p>
       <w:pPr>
         <w:pStyle w:val="ListParagraph"/>
-        <w:spacing w:before="60" w:line="252" w:lineRule="auto"/>
+        <w:spacing w:before="60"/>
         <w:ind w:left="1224"/>
         <w:contextualSpacing w:val="0"/>
         <w:rPr>
@@ -1918,7 +1690,7 @@
     <w:p>
       <w:pPr>
         <w:pStyle w:val="ListParagraph"/>
-        <w:spacing w:before="60" w:line="252" w:lineRule="auto"/>
+        <w:spacing w:before="60"/>
         <w:ind w:left="1224"/>
         <w:contextualSpacing w:val="0"/>
         <w:rPr>
@@ -1941,7 +1713,7 @@
           <w:ilvl w:val="1"/>
           <w:numId w:val="7"/>
         </w:numPr>
-        <w:spacing w:before="120" w:line="252" w:lineRule="auto"/>
+        <w:spacing w:before="120"/>
         <w:ind w:left="1080"/>
         <w:contextualSpacing w:val="0"/>
         <w:rPr>
@@ -1979,7 +1751,7 @@
     <w:p>
       <w:pPr>
         <w:pStyle w:val="ListParagraph"/>
-        <w:spacing w:before="120" w:line="252" w:lineRule="auto"/>
+        <w:spacing w:before="120"/>
         <w:ind w:left="1224"/>
         <w:contextualSpacing w:val="0"/>
         <w:rPr>
@@ -2062,7 +1834,7 @@
           <w:ilvl w:val="1"/>
           <w:numId w:val="7"/>
         </w:numPr>
-        <w:spacing w:before="120" w:line="252" w:lineRule="auto"/>
+        <w:spacing w:before="120"/>
         <w:ind w:left="1080"/>
         <w:contextualSpacing w:val="0"/>
         <w:rPr>
@@ -2089,7 +1861,7 @@
     <w:p>
       <w:pPr>
         <w:pStyle w:val="ListParagraph"/>
-        <w:spacing w:before="60" w:line="252" w:lineRule="auto"/>
+        <w:spacing w:before="60"/>
         <w:ind w:left="1224"/>
         <w:contextualSpacing w:val="0"/>
         <w:rPr>
@@ -2128,7 +1900,7 @@
     <w:p>
       <w:pPr>
         <w:pStyle w:val="ListParagraph"/>
-        <w:spacing w:before="60" w:line="252" w:lineRule="auto"/>
+        <w:spacing w:before="60"/>
         <w:ind w:left="1224"/>
         <w:contextualSpacing w:val="0"/>
         <w:rPr>
@@ -2171,51 +1943,38 @@
         </w:rPr>
         <w:t>Do not use a snippet of code if you do not understand it!</w:t>
       </w:r>
-      <w:r>
-        <w:rPr>
-          <w:rFonts w:asciiTheme="minorHAnsi" w:hAnsiTheme="minorHAnsi"/>
-          <w:color w:val="000000"/>
-        </w:rPr>
-        <w:t xml:space="preserve">  Also, be cautious of using generative-AI tools like ChatGPT</w:t>
-      </w:r>
-      <w:r>
-        <w:rPr>
-          <w:rFonts w:asciiTheme="minorHAnsi" w:hAnsiTheme="minorHAnsi"/>
-          <w:color w:val="000000"/>
-        </w:rPr>
-        <w:t xml:space="preserve"> lest you violate Rule 2.</w:t>
-      </w:r>
-    </w:p>
-    <w:p>
-      <w:pPr>
-        <w:spacing w:before="120" w:line="252" w:lineRule="auto"/>
-        <w:rPr>
-          <w:rFonts w:asciiTheme="minorHAnsi" w:hAnsiTheme="minorHAnsi"/>
-          <w:color w:val="000000"/>
-        </w:rPr>
-      </w:pPr>
-      <w:r>
-        <w:rPr>
-          <w:rFonts w:asciiTheme="minorHAnsi" w:hAnsiTheme="minorHAnsi"/>
-          <w:color w:val="000000"/>
-        </w:rPr>
-        <w:t xml:space="preserve">The normal </w:t>
-      </w:r>
-      <w:r>
-        <w:rPr>
-          <w:rFonts w:asciiTheme="minorHAnsi" w:hAnsiTheme="minorHAnsi"/>
-          <w:b/>
-          <w:bCs/>
-          <w:color w:val="000000"/>
-        </w:rPr>
-        <w:t>penalty</w:t>
-      </w:r>
-      <w:r>
-        <w:rPr>
-          <w:rFonts w:asciiTheme="minorHAnsi" w:hAnsiTheme="minorHAnsi"/>
-          <w:color w:val="000000"/>
-        </w:rPr>
-        <w:t xml:space="preserve"> in this course for </w:t>
+    </w:p>
+    <w:p>
+      <w:pPr>
+        <w:pStyle w:val="ListParagraph"/>
+        <w:numPr>
+          <w:ilvl w:val="0"/>
+          <w:numId w:val="7"/>
+        </w:numPr>
+        <w:spacing w:before="120"/>
+        <w:contextualSpacing w:val="0"/>
+        <w:rPr>
+          <w:rFonts w:asciiTheme="minorHAnsi" w:hAnsiTheme="minorHAnsi"/>
+          <w:color w:val="000000"/>
+        </w:rPr>
+      </w:pPr>
+      <w:r>
+        <w:rPr>
+          <w:rFonts w:asciiTheme="minorHAnsi" w:hAnsiTheme="minorHAnsi"/>
+          <w:b/>
+          <w:bCs/>
+          <w:color w:val="000000"/>
+        </w:rPr>
+        <w:t>Rule 4</w:t>
+      </w:r>
+      <w:r>
+        <w:rPr>
+          <w:rFonts w:asciiTheme="minorHAnsi" w:hAnsiTheme="minorHAnsi"/>
+          <w:b/>
+          <w:bCs/>
+          <w:color w:val="000000"/>
+        </w:rPr>
+        <w:t>, re:</w:t>
       </w:r>
       <w:r>
         <w:rPr>
@@ -2226,7 +1985,7 @@
           <w:iCs/>
           <w:color w:val="000000"/>
         </w:rPr>
-        <w:t xml:space="preserve">getting </w:t>
+        <w:t xml:space="preserve">  U</w:t>
       </w:r>
       <w:r>
         <w:rPr>
@@ -2237,7 +1996,14 @@
           <w:iCs/>
           <w:color w:val="000000"/>
         </w:rPr>
-        <w:t>or giving</w:t>
+        <w:t>sing Generative AI</w:t>
+      </w:r>
+      <w:r>
+        <w:rPr>
+          <w:rFonts w:asciiTheme="minorHAnsi" w:hAnsiTheme="minorHAnsi"/>
+          <w:color w:val="000000"/>
+        </w:rPr>
+        <w:t xml:space="preserve"> (Large Languages Models, LLMs) like </w:t>
       </w:r>
       <w:r>
         <w:rPr>
@@ -2248,46 +2014,481 @@
           <w:iCs/>
           <w:color w:val="000000"/>
         </w:rPr>
+        <w:t>ChatGPT</w:t>
+      </w:r>
+      <w:r>
+        <w:rPr>
+          <w:rFonts w:asciiTheme="minorHAnsi" w:hAnsiTheme="minorHAnsi"/>
+          <w:color w:val="000000"/>
+        </w:rPr>
+        <w:t xml:space="preserve">, </w:t>
+      </w:r>
+      <w:r>
+        <w:rPr>
+          <w:rFonts w:asciiTheme="minorHAnsi" w:hAnsiTheme="minorHAnsi"/>
+          <w:b/>
+          <w:bCs/>
+          <w:i/>
+          <w:iCs/>
+          <w:color w:val="000000"/>
+        </w:rPr>
+        <w:t xml:space="preserve">Google searches </w:t>
+      </w:r>
+      <w:r>
+        <w:rPr>
+          <w:rFonts w:asciiTheme="minorHAnsi" w:hAnsiTheme="minorHAnsi"/>
+          <w:b/>
+          <w:bCs/>
+          <w:i/>
+          <w:iCs/>
+          <w:color w:val="000000"/>
+        </w:rPr>
+        <w:t>yielding</w:t>
+      </w:r>
+      <w:r>
+        <w:rPr>
+          <w:rFonts w:asciiTheme="minorHAnsi" w:hAnsiTheme="minorHAnsi"/>
+          <w:b/>
+          <w:bCs/>
+          <w:i/>
+          <w:iCs/>
+          <w:color w:val="000000"/>
+        </w:rPr>
+        <w:t xml:space="preserve"> an AI result</w:t>
+      </w:r>
+      <w:r>
+        <w:rPr>
+          <w:rFonts w:asciiTheme="minorHAnsi" w:hAnsiTheme="minorHAnsi"/>
+          <w:color w:val="000000"/>
+        </w:rPr>
+        <w:t xml:space="preserve"> (Gemini), and </w:t>
+      </w:r>
+      <w:r>
+        <w:rPr>
+          <w:rFonts w:asciiTheme="minorHAnsi" w:hAnsiTheme="minorHAnsi"/>
+          <w:b/>
+          <w:bCs/>
+          <w:i/>
+          <w:iCs/>
+          <w:color w:val="000000"/>
+        </w:rPr>
+        <w:t>PyCharm/</w:t>
+      </w:r>
+      <w:proofErr w:type="spellStart"/>
+      <w:r>
+        <w:rPr>
+          <w:rFonts w:asciiTheme="minorHAnsi" w:hAnsiTheme="minorHAnsi"/>
+          <w:b/>
+          <w:bCs/>
+          <w:i/>
+          <w:iCs/>
+          <w:color w:val="000000"/>
+        </w:rPr>
+        <w:t>JetBrain</w:t>
+      </w:r>
+      <w:r>
+        <w:rPr>
+          <w:rFonts w:asciiTheme="minorHAnsi" w:hAnsiTheme="minorHAnsi"/>
+          <w:b/>
+          <w:bCs/>
+          <w:i/>
+          <w:iCs/>
+          <w:color w:val="000000"/>
+        </w:rPr>
+        <w:t>’</w:t>
+      </w:r>
+      <w:r>
+        <w:rPr>
+          <w:rFonts w:asciiTheme="minorHAnsi" w:hAnsiTheme="minorHAnsi"/>
+          <w:b/>
+          <w:bCs/>
+          <w:i/>
+          <w:iCs/>
+          <w:color w:val="000000"/>
+        </w:rPr>
+        <w:t>s</w:t>
+      </w:r>
+      <w:proofErr w:type="spellEnd"/>
+      <w:r>
+        <w:rPr>
+          <w:rFonts w:asciiTheme="minorHAnsi" w:hAnsiTheme="minorHAnsi"/>
+          <w:b/>
+          <w:bCs/>
+          <w:i/>
+          <w:iCs/>
+          <w:color w:val="000000"/>
+        </w:rPr>
+        <w:t xml:space="preserve"> optional Intelligent AI</w:t>
+      </w:r>
+      <w:r>
+        <w:rPr>
+          <w:rFonts w:asciiTheme="minorHAnsi" w:hAnsiTheme="minorHAnsi"/>
+          <w:color w:val="000000"/>
+        </w:rPr>
+        <w:t>:</w:t>
+      </w:r>
+    </w:p>
+    <w:p>
+      <w:pPr>
+        <w:pStyle w:val="ListParagraph"/>
+        <w:numPr>
+          <w:ilvl w:val="1"/>
+          <w:numId w:val="7"/>
+        </w:numPr>
+        <w:spacing w:before="120"/>
+        <w:ind w:left="1152"/>
+        <w:contextualSpacing w:val="0"/>
+        <w:rPr>
+          <w:rFonts w:asciiTheme="minorHAnsi" w:hAnsiTheme="minorHAnsi"/>
+          <w:color w:val="000000"/>
+        </w:rPr>
+      </w:pPr>
+      <w:r>
+        <w:rPr>
+          <w:rFonts w:asciiTheme="minorHAnsi" w:hAnsiTheme="minorHAnsi"/>
+          <w:b/>
+          <w:bCs/>
+          <w:color w:val="000000"/>
+        </w:rPr>
+        <w:t>You</w:t>
+      </w:r>
+      <w:r>
+        <w:rPr>
+          <w:rFonts w:asciiTheme="minorHAnsi" w:hAnsiTheme="minorHAnsi"/>
+          <w:b/>
+          <w:bCs/>
+          <w:color w:val="000000"/>
+        </w:rPr>
+        <w:t xml:space="preserve"> are NOT permitted to use these</w:t>
+      </w:r>
+      <w:r>
+        <w:rPr>
+          <w:rFonts w:asciiTheme="minorHAnsi" w:hAnsiTheme="minorHAnsi"/>
+          <w:color w:val="000000"/>
+        </w:rPr>
+        <w:t xml:space="preserve"> for </w:t>
+      </w:r>
+      <w:r>
+        <w:rPr>
+          <w:rFonts w:asciiTheme="minorHAnsi" w:hAnsiTheme="minorHAnsi"/>
+          <w:b/>
+          <w:bCs/>
+          <w:i/>
+          <w:iCs/>
+          <w:color w:val="000000"/>
+        </w:rPr>
+        <w:t>coding</w:t>
+      </w:r>
+      <w:r>
+        <w:rPr>
+          <w:rFonts w:asciiTheme="minorHAnsi" w:hAnsiTheme="minorHAnsi"/>
+          <w:color w:val="000000"/>
+        </w:rPr>
+        <w:t xml:space="preserve"> or </w:t>
+      </w:r>
+      <w:r>
+        <w:rPr>
+          <w:rFonts w:asciiTheme="minorHAnsi" w:hAnsiTheme="minorHAnsi"/>
+          <w:b/>
+          <w:bCs/>
+          <w:i/>
+          <w:iCs/>
+          <w:color w:val="000000"/>
+        </w:rPr>
+        <w:t>program design</w:t>
+      </w:r>
+      <w:r>
+        <w:rPr>
+          <w:rFonts w:asciiTheme="minorHAnsi" w:hAnsiTheme="minorHAnsi"/>
+          <w:color w:val="000000"/>
+        </w:rPr>
+        <w:t xml:space="preserve">, except possibly as directed by your instructor for the Capstone Project.  You </w:t>
+      </w:r>
+      <w:proofErr w:type="gramStart"/>
+      <w:r>
+        <w:rPr>
+          <w:rFonts w:asciiTheme="minorHAnsi" w:hAnsiTheme="minorHAnsi"/>
+          <w:color w:val="000000"/>
+        </w:rPr>
+        <w:t>have to</w:t>
+      </w:r>
+      <w:proofErr w:type="gramEnd"/>
+      <w:r>
+        <w:rPr>
+          <w:rFonts w:asciiTheme="minorHAnsi" w:hAnsiTheme="minorHAnsi"/>
+          <w:color w:val="000000"/>
+        </w:rPr>
+        <w:t xml:space="preserve"> learn how to walk before running; they are great tools, but for students ready to run.</w:t>
+      </w:r>
+    </w:p>
+    <w:p>
+      <w:pPr>
+        <w:pStyle w:val="ListParagraph"/>
+        <w:numPr>
+          <w:ilvl w:val="1"/>
+          <w:numId w:val="7"/>
+        </w:numPr>
+        <w:spacing w:before="120"/>
+        <w:ind w:left="1152"/>
+        <w:contextualSpacing w:val="0"/>
+        <w:rPr>
+          <w:rFonts w:asciiTheme="minorHAnsi" w:hAnsiTheme="minorHAnsi"/>
+          <w:color w:val="000000"/>
+        </w:rPr>
+      </w:pPr>
+      <w:r>
+        <w:rPr>
+          <w:rFonts w:asciiTheme="minorHAnsi" w:hAnsiTheme="minorHAnsi"/>
+          <w:b/>
+          <w:bCs/>
+          <w:color w:val="000000"/>
+        </w:rPr>
+        <w:t>You ARE permitted to use these tools for anything else</w:t>
+      </w:r>
+      <w:r>
+        <w:rPr>
+          <w:rFonts w:asciiTheme="minorHAnsi" w:hAnsiTheme="minorHAnsi"/>
+          <w:color w:val="000000"/>
+        </w:rPr>
+        <w:t>, including:</w:t>
+      </w:r>
+    </w:p>
+    <w:p>
+      <w:pPr>
+        <w:pStyle w:val="ListParagraph"/>
+        <w:numPr>
+          <w:ilvl w:val="2"/>
+          <w:numId w:val="7"/>
+        </w:numPr>
+        <w:spacing w:before="120"/>
+        <w:ind w:left="1800"/>
+        <w:contextualSpacing w:val="0"/>
+        <w:rPr>
+          <w:rFonts w:asciiTheme="minorHAnsi" w:hAnsiTheme="minorHAnsi"/>
+          <w:color w:val="000000"/>
+        </w:rPr>
+      </w:pPr>
+      <w:r>
+        <w:rPr>
+          <w:rFonts w:asciiTheme="minorHAnsi" w:hAnsiTheme="minorHAnsi"/>
+          <w:color w:val="000000"/>
+        </w:rPr>
+        <w:t>Giving an AI some code and asking the AI to explain it.</w:t>
+      </w:r>
+    </w:p>
+    <w:p>
+      <w:pPr>
+        <w:pStyle w:val="ListParagraph"/>
+        <w:numPr>
+          <w:ilvl w:val="2"/>
+          <w:numId w:val="7"/>
+        </w:numPr>
+        <w:spacing w:before="120"/>
+        <w:ind w:left="1800"/>
+        <w:contextualSpacing w:val="0"/>
+        <w:rPr>
+          <w:rFonts w:asciiTheme="minorHAnsi" w:hAnsiTheme="minorHAnsi"/>
+          <w:color w:val="000000"/>
+        </w:rPr>
+      </w:pPr>
+      <w:r>
+        <w:rPr>
+          <w:rFonts w:asciiTheme="minorHAnsi" w:hAnsiTheme="minorHAnsi"/>
+          <w:color w:val="000000"/>
+        </w:rPr>
+        <w:t>Asking an AI for advice on something that does not cause the AI to generate code / program design.</w:t>
+      </w:r>
+    </w:p>
+    <w:p>
+      <w:pPr>
+        <w:pStyle w:val="ListParagraph"/>
+        <w:numPr>
+          <w:ilvl w:val="2"/>
+          <w:numId w:val="7"/>
+        </w:numPr>
+        <w:spacing w:before="120"/>
+        <w:ind w:left="1800"/>
+        <w:contextualSpacing w:val="0"/>
+        <w:rPr>
+          <w:rFonts w:asciiTheme="minorHAnsi" w:hAnsiTheme="minorHAnsi"/>
+          <w:color w:val="000000"/>
+        </w:rPr>
+      </w:pPr>
+      <w:r>
+        <w:rPr>
+          <w:rFonts w:asciiTheme="minorHAnsi" w:hAnsiTheme="minorHAnsi"/>
+          <w:color w:val="000000"/>
+        </w:rPr>
+        <w:t>Asking an AI to help you write some document (NOT code).</w:t>
+      </w:r>
+    </w:p>
+    <w:p>
+      <w:pPr>
+        <w:pStyle w:val="ListParagraph"/>
+        <w:numPr>
+          <w:ilvl w:val="2"/>
+          <w:numId w:val="7"/>
+        </w:numPr>
+        <w:spacing w:before="120"/>
+        <w:ind w:left="1800"/>
+        <w:contextualSpacing w:val="0"/>
+        <w:rPr>
+          <w:rFonts w:asciiTheme="minorHAnsi" w:hAnsiTheme="minorHAnsi"/>
+          <w:color w:val="000000"/>
+        </w:rPr>
+      </w:pPr>
+      <w:r>
+        <w:rPr>
+          <w:rFonts w:asciiTheme="minorHAnsi" w:hAnsiTheme="minorHAnsi"/>
+          <w:color w:val="000000"/>
+        </w:rPr>
+        <w:t xml:space="preserve">Asking an AI to suggest a good Mexican restaurant </w:t>
+      </w:r>
+      <w:r>
+        <w:rPr>
+          <w:rFonts w:asciiTheme="minorHAnsi" w:hAnsiTheme="minorHAnsi"/>
+          <w:color w:val="000000"/>
+        </w:rPr>
+        <w:sym w:font="Wingdings" w:char="F04A"/>
+      </w:r>
+      <w:r>
+        <w:rPr>
+          <w:rFonts w:asciiTheme="minorHAnsi" w:hAnsiTheme="minorHAnsi"/>
+          <w:color w:val="000000"/>
+        </w:rPr>
+        <w:t>.</w:t>
+      </w:r>
+    </w:p>
+    <w:p>
+      <w:pPr>
+        <w:pStyle w:val="ListParagraph"/>
+        <w:numPr>
+          <w:ilvl w:val="0"/>
+          <w:numId w:val="7"/>
+        </w:numPr>
+        <w:spacing w:before="120"/>
+        <w:contextualSpacing w:val="0"/>
+        <w:rPr>
+          <w:rFonts w:asciiTheme="minorHAnsi" w:hAnsiTheme="minorHAnsi"/>
+          <w:color w:val="000000"/>
+        </w:rPr>
+      </w:pPr>
+      <w:r>
+        <w:rPr>
+          <w:rFonts w:asciiTheme="minorHAnsi" w:hAnsiTheme="minorHAnsi"/>
+          <w:b/>
+          <w:bCs/>
+          <w:color w:val="000000"/>
+        </w:rPr>
+        <w:t xml:space="preserve">Rule </w:t>
+      </w:r>
+      <w:r>
+        <w:rPr>
+          <w:rFonts w:asciiTheme="minorHAnsi" w:hAnsiTheme="minorHAnsi"/>
+          <w:b/>
+          <w:bCs/>
+          <w:color w:val="000000"/>
+        </w:rPr>
+        <w:t>5</w:t>
+      </w:r>
+      <w:r>
+        <w:rPr>
+          <w:rFonts w:asciiTheme="minorHAnsi" w:hAnsiTheme="minorHAnsi"/>
+          <w:b/>
+          <w:bCs/>
+          <w:color w:val="000000"/>
+        </w:rPr>
+        <w:t>, re</w:t>
+      </w:r>
+      <w:r>
+        <w:rPr>
+          <w:rFonts w:asciiTheme="minorHAnsi" w:hAnsiTheme="minorHAnsi"/>
+          <w:b/>
+          <w:bCs/>
+          <w:color w:val="000000"/>
+        </w:rPr>
+        <w:t xml:space="preserve">: </w:t>
+      </w:r>
+      <w:r>
+        <w:rPr>
+          <w:rFonts w:asciiTheme="minorHAnsi" w:hAnsiTheme="minorHAnsi"/>
+          <w:b/>
+          <w:bCs/>
+          <w:color w:val="000000"/>
+        </w:rPr>
         <w:t xml:space="preserve"> </w:t>
       </w:r>
       <w:r>
         <w:rPr>
           <w:rFonts w:asciiTheme="minorHAnsi" w:hAnsiTheme="minorHAnsi"/>
-          <w:color w:val="000000"/>
-        </w:rPr>
-        <w:t>help to another student on an exam is an F in the course.</w:t>
-      </w:r>
-      <w:r>
-        <w:rPr>
-          <w:rFonts w:asciiTheme="minorHAnsi" w:hAnsiTheme="minorHAnsi"/>
-          <w:color w:val="000000"/>
-        </w:rPr>
-        <w:t xml:space="preserve">  </w:t>
-      </w:r>
-      <w:r>
-        <w:rPr>
-          <w:rFonts w:asciiTheme="minorHAnsi" w:hAnsiTheme="minorHAnsi"/>
-          <w:color w:val="000000"/>
-        </w:rPr>
-        <w:t>Repeated Academic Misconduct will lead to the student being dismissed from Rose-Hulman</w:t>
-      </w:r>
-      <w:r>
-        <w:rPr>
-          <w:rFonts w:asciiTheme="minorHAnsi" w:hAnsiTheme="minorHAnsi"/>
-          <w:color w:val="000000"/>
-        </w:rPr>
-        <w:t>.</w:t>
-      </w:r>
-    </w:p>
-    <w:p>
-      <w:pPr>
-        <w:spacing w:before="120" w:line="252" w:lineRule="auto"/>
+          <w:b/>
+          <w:bCs/>
+          <w:i/>
+          <w:iCs/>
+          <w:color w:val="000000"/>
+        </w:rPr>
+        <w:t>Re-using work from a previous term</w:t>
+      </w:r>
+      <w:r>
+        <w:rPr>
+          <w:rFonts w:asciiTheme="minorHAnsi" w:hAnsiTheme="minorHAnsi"/>
+          <w:color w:val="000000"/>
+        </w:rPr>
+        <w:t>:</w:t>
+      </w:r>
+    </w:p>
+    <w:p>
+      <w:pPr>
+        <w:pStyle w:val="ListParagraph"/>
+        <w:numPr>
+          <w:ilvl w:val="1"/>
+          <w:numId w:val="7"/>
+        </w:numPr>
+        <w:spacing w:before="120"/>
+        <w:ind w:left="1152"/>
+        <w:contextualSpacing w:val="0"/>
+        <w:rPr>
+          <w:rFonts w:asciiTheme="minorHAnsi" w:hAnsiTheme="minorHAnsi"/>
+          <w:color w:val="000000"/>
+        </w:rPr>
+      </w:pPr>
+      <w:r>
+        <w:rPr>
+          <w:rFonts w:asciiTheme="minorHAnsi" w:hAnsiTheme="minorHAnsi"/>
+          <w:b/>
+          <w:bCs/>
+          <w:color w:val="000000"/>
+        </w:rPr>
+        <w:t>In general, you may NOT turn in work from a previous term</w:t>
+      </w:r>
+      <w:r>
+        <w:rPr>
+          <w:rFonts w:asciiTheme="minorHAnsi" w:hAnsiTheme="minorHAnsi"/>
+          <w:color w:val="000000"/>
+        </w:rPr>
+        <w:t xml:space="preserve"> without recreating it.  You are welcome to READ your OWN work from a previous term.  If you think that re-using such work without recreating it would be beneficial to your learning, discuss that with your instructor for possible special dispensation.</w:t>
+      </w:r>
+    </w:p>
+    <w:p>
+      <w:pPr>
+        <w:spacing w:before="120"/>
+        <w:rPr>
+          <w:rFonts w:asciiTheme="minorHAnsi" w:hAnsiTheme="minorHAnsi"/>
+          <w:color w:val="000000"/>
+        </w:rPr>
+      </w:pPr>
+    </w:p>
+    <w:p>
+      <w:pPr>
+        <w:spacing w:before="120"/>
         <w:jc w:val="center"/>
         <w:rPr>
           <w:rFonts w:asciiTheme="minorHAnsi" w:hAnsiTheme="minorHAnsi"/>
           <w:b/>
           <w:bCs/>
           <w:color w:val="FF0000"/>
+          <w:sz w:val="32"/>
+          <w:szCs w:val="32"/>
         </w:rPr>
       </w:pPr>
       <w:r>
@@ -2296,6 +2497,8 @@
           <w:b/>
           <w:bCs/>
           <w:color w:val="FF0000"/>
+          <w:sz w:val="32"/>
+          <w:szCs w:val="32"/>
         </w:rPr>
         <w:t xml:space="preserve">If you are tempted to cheat, don't. </w:t>
       </w:r>
@@ -2305,6 +2508,8 @@
           <w:b/>
           <w:bCs/>
           <w:color w:val="FF0000"/>
+          <w:sz w:val="32"/>
+          <w:szCs w:val="32"/>
         </w:rPr>
         <w:t>  </w:t>
@@ -2315,6 +2520,8 @@
           <w:b/>
           <w:bCs/>
           <w:color w:val="FF0000"/>
+          <w:sz w:val="32"/>
+          <w:szCs w:val="32"/>
         </w:rPr>
         <w:t>Come talk to us instead.</w:t>
       </w:r>
@@ -2333,8 +2540,8 @@
           <w:highlight w:val="yellow"/>
         </w:rPr>
       </w:pPr>
-      <w:bookmarkStart w:id="5" w:name="_Assessment_(how_you"/>
-      <w:bookmarkEnd w:id="5"/>
+      <w:bookmarkStart w:id="4" w:name="_Assessment_(how_you"/>
+      <w:bookmarkEnd w:id="4"/>
       <w:r>
         <w:rPr>
           <w:rFonts w:asciiTheme="minorHAnsi" w:hAnsiTheme="minorHAnsi"/>
@@ -2381,7 +2588,7 @@
     </w:p>
     <w:p>
       <w:pPr>
-        <w:spacing w:before="120" w:line="252" w:lineRule="auto"/>
+        <w:spacing w:before="120"/>
         <w:rPr>
           <w:rFonts w:asciiTheme="minorHAnsi" w:hAnsiTheme="minorHAnsi"/>
           <w:b/>
@@ -2459,7 +2666,7 @@
     </w:p>
     <w:p>
       <w:pPr>
-        <w:spacing w:before="120" w:line="252" w:lineRule="auto"/>
+        <w:spacing w:before="120"/>
         <w:rPr>
           <w:rFonts w:asciiTheme="minorHAnsi" w:hAnsiTheme="minorHAnsi"/>
           <w:color w:val="000000"/>
@@ -2475,7 +2682,7 @@
     </w:p>
     <w:p>
       <w:pPr>
-        <w:spacing w:before="120" w:after="120" w:line="252" w:lineRule="auto"/>
+        <w:spacing w:before="120" w:after="120"/>
         <w:rPr>
           <w:rFonts w:asciiTheme="minorHAnsi" w:hAnsiTheme="minorHAnsi"/>
           <w:color w:val="000000"/>
@@ -2547,7 +2754,7 @@
           </w:tcPr>
           <w:p>
             <w:pPr>
-              <w:spacing w:before="120" w:line="252" w:lineRule="auto"/>
+              <w:spacing w:before="120"/>
               <w:jc w:val="center"/>
               <w:rPr>
                 <w:rFonts w:asciiTheme="minorHAnsi" w:hAnsiTheme="minorHAnsi"/>
@@ -2587,7 +2794,7 @@
           </w:p>
           <w:p>
             <w:pPr>
-              <w:spacing w:before="120" w:line="252" w:lineRule="auto"/>
+              <w:spacing w:before="120"/>
               <w:jc w:val="center"/>
               <w:rPr>
                 <w:rFonts w:asciiTheme="minorHAnsi" w:hAnsiTheme="minorHAnsi"/>
@@ -2620,7 +2827,7 @@
           </w:tcPr>
           <w:p>
             <w:pPr>
-              <w:spacing w:before="120" w:line="252" w:lineRule="auto"/>
+              <w:spacing w:before="120"/>
               <w:jc w:val="center"/>
               <w:rPr>
                 <w:rFonts w:asciiTheme="minorHAnsi" w:hAnsiTheme="minorHAnsi"/>
@@ -2678,7 +2885,7 @@
           </w:p>
           <w:p>
             <w:pPr>
-              <w:spacing w:before="120" w:line="252" w:lineRule="auto"/>
+              <w:spacing w:before="120"/>
               <w:jc w:val="center"/>
               <w:rPr>
                 <w:rFonts w:asciiTheme="minorHAnsi" w:hAnsiTheme="minorHAnsi"/>
@@ -2729,7 +2936,7 @@
           </w:tcPr>
           <w:p>
             <w:pPr>
-              <w:spacing w:before="120" w:line="252" w:lineRule="auto"/>
+              <w:spacing w:before="120"/>
               <w:jc w:val="center"/>
               <w:rPr>
                 <w:rFonts w:asciiTheme="minorHAnsi" w:hAnsiTheme="minorHAnsi"/>
@@ -2778,7 +2985,7 @@
           </w:p>
           <w:p>
             <w:pPr>
-              <w:spacing w:before="120" w:line="252" w:lineRule="auto"/>
+              <w:spacing w:before="120"/>
               <w:jc w:val="center"/>
               <w:rPr>
                 <w:rFonts w:asciiTheme="minorHAnsi" w:hAnsiTheme="minorHAnsi"/>
@@ -2829,7 +3036,7 @@
           </w:tcPr>
           <w:p>
             <w:pPr>
-              <w:spacing w:before="120" w:line="252" w:lineRule="auto"/>
+              <w:spacing w:before="120"/>
               <w:jc w:val="center"/>
               <w:rPr>
                 <w:rFonts w:asciiTheme="minorHAnsi" w:hAnsiTheme="minorHAnsi"/>
@@ -2871,7 +3078,7 @@
     </w:tbl>
     <w:p>
       <w:pPr>
-        <w:spacing w:before="120" w:line="252" w:lineRule="auto"/>
+        <w:spacing w:before="120"/>
         <w:rPr>
           <w:rFonts w:asciiTheme="minorHAnsi" w:hAnsiTheme="minorHAnsi"/>
           <w:color w:val="000000"/>
@@ -2968,7 +3175,7 @@
     </w:p>
     <w:p>
       <w:pPr>
-        <w:spacing w:before="120" w:after="120" w:line="252" w:lineRule="auto"/>
+        <w:spacing w:before="120" w:after="120"/>
         <w:rPr>
           <w:rFonts w:asciiTheme="minorHAnsi" w:hAnsiTheme="minorHAnsi"/>
           <w:color w:val="000000"/>
@@ -3306,7 +3513,7 @@
     </w:tbl>
     <w:p>
       <w:pPr>
-        <w:spacing w:before="120" w:line="252" w:lineRule="auto"/>
+        <w:spacing w:before="120"/>
         <w:rPr>
           <w:rFonts w:asciiTheme="minorHAnsi" w:hAnsiTheme="minorHAnsi"/>
           <w:color w:val="000000"/>
@@ -3322,7 +3529,7 @@
     </w:p>
     <w:p>
       <w:pPr>
-        <w:spacing w:before="120" w:after="120" w:line="252" w:lineRule="auto"/>
+        <w:spacing w:before="120" w:after="120"/>
         <w:rPr>
           <w:rFonts w:asciiTheme="minorHAnsi" w:hAnsiTheme="minorHAnsi"/>
           <w:color w:val="000000"/>
@@ -3399,7 +3606,8 @@
           <w:ilvl w:val="0"/>
           <w:numId w:val="7"/>
         </w:numPr>
-        <w:spacing w:before="120" w:after="120" w:line="252" w:lineRule="auto"/>
+        <w:spacing w:before="120" w:after="120"/>
+        <w:contextualSpacing w:val="0"/>
         <w:rPr>
           <w:rFonts w:asciiTheme="minorHAnsi" w:hAnsiTheme="minorHAnsi"/>
           <w:color w:val="000000"/>
@@ -3427,7 +3635,8 @@
           <w:ilvl w:val="0"/>
           <w:numId w:val="7"/>
         </w:numPr>
-        <w:spacing w:before="120" w:after="120" w:line="252" w:lineRule="auto"/>
+        <w:spacing w:before="120" w:after="120"/>
+        <w:contextualSpacing w:val="0"/>
         <w:rPr>
           <w:rFonts w:asciiTheme="minorHAnsi" w:hAnsiTheme="minorHAnsi"/>
           <w:color w:val="000000"/>
@@ -3448,7 +3657,8 @@
           <w:ilvl w:val="0"/>
           <w:numId w:val="7"/>
         </w:numPr>
-        <w:spacing w:before="120" w:after="120" w:line="252" w:lineRule="auto"/>
+        <w:spacing w:before="120" w:after="120"/>
+        <w:contextualSpacing w:val="0"/>
         <w:rPr>
           <w:rFonts w:asciiTheme="minorHAnsi" w:hAnsiTheme="minorHAnsi"/>
           <w:color w:val="000000"/>
@@ -3464,7 +3674,7 @@
     </w:p>
     <w:p>
       <w:pPr>
-        <w:spacing w:before="120" w:line="252" w:lineRule="auto"/>
+        <w:spacing w:before="120"/>
         <w:rPr>
           <w:rFonts w:ascii="MS Gothic" w:eastAsia="MS Gothic" w:hAnsi="MS Gothic" w:cs="MS Gothic"/>
           <w:color w:val="000000"/>
@@ -3473,7 +3683,7 @@
     </w:p>
     <w:p>
       <w:pPr>
-        <w:spacing w:before="120" w:line="252" w:lineRule="auto"/>
+        <w:spacing w:before="120"/>
         <w:rPr>
           <w:rFonts w:ascii="MS Gothic" w:eastAsia="MS Gothic" w:hAnsi="MS Gothic" w:cs="MS Gothic"/>
           <w:color w:val="000000"/>
@@ -3482,7 +3692,7 @@
     </w:p>
     <w:p>
       <w:pPr>
-        <w:spacing w:before="120" w:line="252" w:lineRule="auto"/>
+        <w:spacing w:before="120"/>
         <w:rPr>
           <w:rFonts w:asciiTheme="minorHAnsi" w:hAnsiTheme="minorHAnsi"/>
           <w:color w:val="000000"/>
@@ -3550,7 +3760,7 @@
     <w:p>
       <w:pPr>
         <w:pStyle w:val="Heading2"/>
-        <w:spacing w:before="120" w:beforeAutospacing="0" w:after="0" w:afterAutospacing="0" w:line="252" w:lineRule="auto"/>
+        <w:spacing w:before="120" w:beforeAutospacing="0" w:after="0" w:afterAutospacing="0"/>
         <w:jc w:val="center"/>
         <w:rPr>
           <w:rFonts w:asciiTheme="minorHAnsi" w:hAnsiTheme="minorHAnsi"/>
@@ -3600,7 +3810,7 @@
     <w:p>
       <w:pPr>
         <w:pStyle w:val="NormalWeb"/>
-        <w:spacing w:before="120" w:beforeAutospacing="0" w:after="0" w:afterAutospacing="0" w:line="252" w:lineRule="auto"/>
+        <w:spacing w:before="120" w:beforeAutospacing="0" w:after="0" w:afterAutospacing="0"/>
         <w:rPr>
           <w:rFonts w:asciiTheme="minorHAnsi" w:hAnsiTheme="minorHAnsi"/>
           <w:color w:val="000000"/>
@@ -3645,7 +3855,7 @@
     <w:p>
       <w:pPr>
         <w:pStyle w:val="NormalWeb"/>
-        <w:spacing w:before="120" w:beforeAutospacing="0" w:after="0" w:afterAutospacing="0" w:line="252" w:lineRule="auto"/>
+        <w:spacing w:before="120" w:beforeAutospacing="0" w:after="0" w:afterAutospacing="0"/>
         <w:rPr>
           <w:rFonts w:asciiTheme="minorHAnsi" w:hAnsiTheme="minorHAnsi"/>
           <w:color w:val="000000"/>
@@ -3694,7 +3904,7 @@
     <w:p>
       <w:pPr>
         <w:pStyle w:val="NormalWeb"/>
-        <w:spacing w:before="120" w:beforeAutospacing="0" w:after="0" w:afterAutospacing="0" w:line="252" w:lineRule="auto"/>
+        <w:spacing w:before="120" w:beforeAutospacing="0" w:after="0" w:afterAutospacing="0"/>
         <w:rPr>
           <w:rFonts w:asciiTheme="minorHAnsi" w:hAnsiTheme="minorHAnsi"/>
           <w:color w:val="000000"/>
@@ -3738,7 +3948,7 @@
     <w:p>
       <w:pPr>
         <w:pStyle w:val="NormalWeb"/>
-        <w:spacing w:before="120" w:beforeAutospacing="0" w:after="0" w:afterAutospacing="0" w:line="252" w:lineRule="auto"/>
+        <w:spacing w:before="120" w:beforeAutospacing="0" w:after="0" w:afterAutospacing="0"/>
         <w:rPr>
           <w:rFonts w:asciiTheme="minorHAnsi" w:hAnsiTheme="minorHAnsi"/>
           <w:color w:val="000000"/>
@@ -3771,7 +3981,7 @@
     </w:p>
     <w:p>
       <w:pPr>
-        <w:spacing w:before="120" w:line="252" w:lineRule="auto"/>
+        <w:spacing w:before="120"/>
         <w:rPr>
           <w:rFonts w:asciiTheme="minorHAnsi" w:hAnsiTheme="minorHAnsi"/>
           <w:color w:val="000000"/>
@@ -3819,7 +4029,7 @@
     </w:p>
     <w:p>
       <w:pPr>
-        <w:spacing w:before="120" w:line="252" w:lineRule="auto"/>
+        <w:spacing w:before="120"/>
         <w:rPr>
           <w:rFonts w:asciiTheme="minorHAnsi" w:hAnsiTheme="minorHAnsi"/>
           <w:color w:val="000000"/>
@@ -3867,7 +4077,7 @@
           <w:ilvl w:val="0"/>
           <w:numId w:val="9"/>
         </w:numPr>
-        <w:spacing w:before="120" w:line="252" w:lineRule="auto"/>
+        <w:spacing w:before="120"/>
         <w:rPr>
           <w:rFonts w:asciiTheme="minorHAnsi" w:hAnsiTheme="minorHAnsi"/>
           <w:color w:val="000000"/>
@@ -3894,7 +4104,7 @@
           <w:ilvl w:val="0"/>
           <w:numId w:val="9"/>
         </w:numPr>
-        <w:spacing w:before="120" w:line="252" w:lineRule="auto"/>
+        <w:spacing w:before="120"/>
         <w:rPr>
           <w:rFonts w:asciiTheme="minorHAnsi" w:hAnsiTheme="minorHAnsi"/>
           <w:color w:val="000000"/>
@@ -3914,7 +4124,7 @@
           <w:ilvl w:val="0"/>
           <w:numId w:val="9"/>
         </w:numPr>
-        <w:spacing w:before="120" w:line="252" w:lineRule="auto"/>
+        <w:spacing w:before="120"/>
         <w:rPr>
           <w:rFonts w:asciiTheme="minorHAnsi" w:hAnsiTheme="minorHAnsi"/>
           <w:color w:val="000000"/>
@@ -3934,7 +4144,7 @@
           <w:ilvl w:val="0"/>
           <w:numId w:val="9"/>
         </w:numPr>
-        <w:spacing w:before="120" w:line="252" w:lineRule="auto"/>
+        <w:spacing w:before="120"/>
         <w:rPr>
           <w:rFonts w:asciiTheme="minorHAnsi" w:hAnsiTheme="minorHAnsi"/>
           <w:color w:val="000000"/>
@@ -3954,7 +4164,7 @@
           <w:ilvl w:val="0"/>
           <w:numId w:val="9"/>
         </w:numPr>
-        <w:spacing w:before="120" w:line="252" w:lineRule="auto"/>
+        <w:spacing w:before="120"/>
         <w:rPr>
           <w:rFonts w:asciiTheme="minorHAnsi" w:hAnsiTheme="minorHAnsi"/>
           <w:color w:val="000000"/>
@@ -3974,7 +4184,7 @@
           <w:ilvl w:val="0"/>
           <w:numId w:val="9"/>
         </w:numPr>
-        <w:spacing w:before="120" w:line="252" w:lineRule="auto"/>
+        <w:spacing w:before="120"/>
         <w:rPr>
           <w:rFonts w:asciiTheme="minorHAnsi" w:hAnsiTheme="minorHAnsi"/>
           <w:color w:val="000000"/>
@@ -3994,7 +4204,7 @@
           <w:ilvl w:val="0"/>
           <w:numId w:val="9"/>
         </w:numPr>
-        <w:spacing w:before="120" w:line="252" w:lineRule="auto"/>
+        <w:spacing w:before="120"/>
         <w:rPr>
           <w:rFonts w:asciiTheme="minorHAnsi" w:hAnsiTheme="minorHAnsi"/>
           <w:color w:val="000000"/>
@@ -4010,7 +4220,7 @@
     </w:p>
     <w:p>
       <w:pPr>
-        <w:spacing w:before="120" w:line="252" w:lineRule="auto"/>
+        <w:spacing w:before="120"/>
         <w:ind w:left="360"/>
         <w:rPr>
           <w:rFonts w:asciiTheme="minorHAnsi" w:hAnsiTheme="minorHAnsi"/>
@@ -4084,7 +4294,7 @@
     </w:p>
     <w:p>
       <w:pPr>
-        <w:spacing w:before="120" w:line="252" w:lineRule="auto"/>
+        <w:spacing w:before="120"/>
         <w:rPr>
           <w:rFonts w:asciiTheme="minorHAnsi" w:hAnsiTheme="minorHAnsi"/>
           <w:color w:val="364451"/>
@@ -4126,8 +4336,8 @@
           <w:szCs w:val="40"/>
         </w:rPr>
       </w:pPr>
-      <w:bookmarkStart w:id="6" w:name="_Making_our_classroom"/>
-      <w:bookmarkEnd w:id="6"/>
+      <w:bookmarkStart w:id="5" w:name="_Making_our_classroom"/>
+      <w:bookmarkEnd w:id="5"/>
       <w:r>
         <w:rPr>
           <w:rFonts w:asciiTheme="minorHAnsi" w:eastAsia="Times New Roman" w:hAnsiTheme="minorHAnsi"/>
@@ -4146,7 +4356,7 @@
     <w:p>
       <w:pPr>
         <w:pStyle w:val="Heading1"/>
-        <w:spacing w:before="120" w:line="252" w:lineRule="auto"/>
+        <w:spacing w:before="120"/>
         <w:rPr>
           <w:rFonts w:asciiTheme="minorHAnsi" w:hAnsiTheme="minorHAnsi"/>
           <w:b/>
@@ -4200,7 +4410,7 @@
           <w:ilvl w:val="0"/>
           <w:numId w:val="12"/>
         </w:numPr>
-        <w:spacing w:before="120" w:line="252" w:lineRule="auto"/>
+        <w:spacing w:before="120"/>
         <w:rPr>
           <w:rFonts w:asciiTheme="minorHAnsi" w:hAnsiTheme="minorHAnsi"/>
           <w:color w:val="000000"/>
@@ -4272,7 +4482,7 @@
           <w:ilvl w:val="0"/>
           <w:numId w:val="12"/>
         </w:numPr>
-        <w:spacing w:before="120" w:line="252" w:lineRule="auto"/>
+        <w:spacing w:before="120"/>
         <w:rPr>
           <w:rFonts w:asciiTheme="minorHAnsi" w:hAnsiTheme="minorHAnsi"/>
           <w:color w:val="000000"/>
@@ -4308,7 +4518,7 @@
           <w:ilvl w:val="0"/>
           <w:numId w:val="12"/>
         </w:numPr>
-        <w:spacing w:before="120" w:line="252" w:lineRule="auto"/>
+        <w:spacing w:before="120"/>
         <w:rPr>
           <w:rFonts w:asciiTheme="minorHAnsi" w:hAnsiTheme="minorHAnsi"/>
           <w:color w:val="000000"/>
@@ -4376,7 +4586,7 @@
     <w:p>
       <w:pPr>
         <w:pStyle w:val="Heading1"/>
-        <w:spacing w:before="120" w:line="252" w:lineRule="auto"/>
+        <w:spacing w:before="120"/>
         <w:ind w:left="720"/>
         <w:rPr>
           <w:rFonts w:asciiTheme="minorHAnsi" w:hAnsiTheme="minorHAnsi"/>
@@ -4427,7 +4637,7 @@
     <w:p>
       <w:pPr>
         <w:pStyle w:val="Heading1"/>
-        <w:spacing w:before="120" w:line="252" w:lineRule="auto"/>
+        <w:spacing w:before="120"/>
         <w:ind w:left="720"/>
         <w:rPr>
           <w:rFonts w:asciiTheme="minorHAnsi" w:hAnsiTheme="minorHAnsi"/>
@@ -4482,7 +4692,7 @@
     <w:p>
       <w:pPr>
         <w:pStyle w:val="Heading1"/>
-        <w:spacing w:before="120" w:line="252" w:lineRule="auto"/>
+        <w:spacing w:before="120"/>
         <w:ind w:left="720"/>
         <w:rPr>
           <w:rFonts w:asciiTheme="minorHAnsi" w:hAnsiTheme="minorHAnsi"/>
@@ -4599,7 +4809,7 @@
           <w:ilvl w:val="0"/>
           <w:numId w:val="12"/>
         </w:numPr>
-        <w:spacing w:before="120" w:line="252" w:lineRule="auto"/>
+        <w:spacing w:before="120"/>
         <w:rPr>
           <w:rFonts w:asciiTheme="minorHAnsi" w:hAnsiTheme="minorHAnsi"/>
           <w:color w:val="000000"/>
@@ -4635,7 +4845,7 @@
           <w:ilvl w:val="0"/>
           <w:numId w:val="12"/>
         </w:numPr>
-        <w:spacing w:before="120" w:line="252" w:lineRule="auto"/>
+        <w:spacing w:before="120"/>
         <w:rPr>
           <w:rFonts w:asciiTheme="minorHAnsi" w:hAnsiTheme="minorHAnsi"/>
           <w:color w:val="000000"/>
@@ -4698,7 +4908,7 @@
           <w:ilvl w:val="0"/>
           <w:numId w:val="12"/>
         </w:numPr>
-        <w:spacing w:before="120" w:line="252" w:lineRule="auto"/>
+        <w:spacing w:before="120"/>
         <w:rPr>
           <w:rFonts w:asciiTheme="minorHAnsi" w:hAnsiTheme="minorHAnsi"/>
           <w:color w:val="000000"/>
@@ -4730,7 +4940,7 @@
     <w:p>
       <w:pPr>
         <w:pStyle w:val="Heading1"/>
-        <w:spacing w:before="120" w:line="252" w:lineRule="auto"/>
+        <w:spacing w:before="120"/>
         <w:rPr>
           <w:rFonts w:asciiTheme="minorHAnsi" w:hAnsiTheme="minorHAnsi"/>
           <w:color w:val="000000"/>
@@ -4798,7 +5008,7 @@
     <w:p>
       <w:pPr>
         <w:pStyle w:val="Heading1"/>
-        <w:spacing w:before="120" w:line="252" w:lineRule="auto"/>
+        <w:spacing w:before="120"/>
         <w:rPr>
           <w:rFonts w:asciiTheme="minorHAnsi" w:hAnsiTheme="minorHAnsi"/>
           <w:color w:val="000000"/>
@@ -4900,7 +5110,7 @@
           <w:ilvl w:val="0"/>
           <w:numId w:val="24"/>
         </w:numPr>
-        <w:spacing w:before="120" w:line="252" w:lineRule="auto"/>
+        <w:spacing w:before="120"/>
         <w:contextualSpacing w:val="0"/>
         <w:rPr>
           <w:rStyle w:val="important"/>
@@ -4923,7 +5133,7 @@
           <w:ilvl w:val="0"/>
           <w:numId w:val="24"/>
         </w:numPr>
-        <w:spacing w:before="120" w:line="252" w:lineRule="auto"/>
+        <w:spacing w:before="120"/>
         <w:contextualSpacing w:val="0"/>
         <w:rPr>
           <w:rStyle w:val="important"/>
@@ -4989,16 +5199,7 @@
           <w:rFonts w:asciiTheme="minorHAnsi" w:hAnsiTheme="minorHAnsi"/>
           <w:color w:val="000000"/>
         </w:rPr>
-        <w:t xml:space="preserve">Robert </w:t>
-      </w:r>
-      <w:r>
-        <w:rPr>
-          <w:rStyle w:val="important"/>
-          <w:rFonts w:asciiTheme="minorHAnsi" w:hAnsiTheme="minorHAnsi"/>
-          <w:color w:val="000000"/>
-        </w:rPr>
-        <w:lastRenderedPageBreak/>
-        <w:t>Williamson (</w:t>
+        <w:t>Robert Williamson (</w:t>
       </w:r>
       <w:hyperlink r:id="rId22" w:history="1">
         <w:r>
@@ -5026,7 +5227,7 @@
           <w:ilvl w:val="0"/>
           <w:numId w:val="24"/>
         </w:numPr>
-        <w:spacing w:before="120" w:line="252" w:lineRule="auto"/>
+        <w:spacing w:before="120"/>
         <w:contextualSpacing w:val="0"/>
         <w:rPr>
           <w:rStyle w:val="important"/>
@@ -5040,6 +5241,7 @@
           <w:rFonts w:asciiTheme="minorHAnsi" w:hAnsiTheme="minorHAnsi"/>
           <w:color w:val="000000"/>
         </w:rPr>
+        <w:lastRenderedPageBreak/>
         <w:t>All of</w:t>
       </w:r>
       <w:proofErr w:type="gramEnd"/>
@@ -5103,7 +5305,7 @@
           <w:ilvl w:val="0"/>
           <w:numId w:val="24"/>
         </w:numPr>
-        <w:spacing w:before="120" w:line="252" w:lineRule="auto"/>
+        <w:spacing w:before="120"/>
         <w:contextualSpacing w:val="0"/>
         <w:rPr>
           <w:rFonts w:asciiTheme="minorHAnsi" w:hAnsiTheme="minorHAnsi"/>
@@ -5141,7 +5343,7 @@
     </w:p>
     <w:p>
       <w:pPr>
-        <w:spacing w:before="120" w:line="252" w:lineRule="auto"/>
+        <w:spacing w:before="120"/>
         <w:rPr>
           <w:rFonts w:asciiTheme="minorHAnsi" w:hAnsiTheme="minorHAnsi"/>
           <w:color w:val="364451"/>
@@ -5162,8 +5364,8 @@
           <w:szCs w:val="40"/>
         </w:rPr>
       </w:pPr>
-      <w:bookmarkStart w:id="7" w:name="_Attendance_and_Late"/>
-      <w:bookmarkEnd w:id="7"/>
+      <w:bookmarkStart w:id="6" w:name="_Attendance_and_Late"/>
+      <w:bookmarkEnd w:id="6"/>
       <w:r>
         <w:rPr>
           <w:rFonts w:asciiTheme="minorHAnsi" w:eastAsia="Times New Roman" w:hAnsiTheme="minorHAnsi"/>
@@ -5180,7 +5382,7 @@
     </w:p>
     <w:p>
       <w:pPr>
-        <w:spacing w:before="120" w:line="252" w:lineRule="auto"/>
+        <w:spacing w:before="120"/>
         <w:rPr>
           <w:rFonts w:asciiTheme="minorHAnsi" w:hAnsiTheme="minorHAnsi"/>
           <w:color w:val="000000"/>
@@ -5228,7 +5430,7 @@
     </w:p>
     <w:p>
       <w:pPr>
-        <w:spacing w:before="120" w:line="252" w:lineRule="auto"/>
+        <w:spacing w:before="120"/>
         <w:rPr>
           <w:rFonts w:asciiTheme="minorHAnsi" w:hAnsiTheme="minorHAnsi"/>
           <w:color w:val="000000"/>
@@ -5316,7 +5518,8 @@
           <w:ilvl w:val="0"/>
           <w:numId w:val="25"/>
         </w:numPr>
-        <w:spacing w:before="120" w:line="252" w:lineRule="auto"/>
+        <w:spacing w:before="120"/>
+        <w:contextualSpacing w:val="0"/>
         <w:rPr>
           <w:rFonts w:asciiTheme="minorHAnsi" w:hAnsiTheme="minorHAnsi"/>
           <w:color w:val="000000"/>
@@ -5373,7 +5576,7 @@
     </w:p>
     <w:p>
       <w:pPr>
-        <w:spacing w:before="120" w:line="252" w:lineRule="auto"/>
+        <w:spacing w:before="120"/>
         <w:rPr>
           <w:rFonts w:asciiTheme="minorHAnsi" w:hAnsiTheme="minorHAnsi"/>
           <w:color w:val="000000"/>
@@ -5449,7 +5652,7 @@
     </w:p>
     <w:p>
       <w:pPr>
-        <w:spacing w:before="120" w:line="252" w:lineRule="auto"/>
+        <w:spacing w:before="120"/>
         <w:rPr>
           <w:rFonts w:asciiTheme="minorHAnsi" w:hAnsiTheme="minorHAnsi"/>
           <w:color w:val="364451"/>
@@ -5471,8 +5674,8 @@
           <w:highlight w:val="yellow"/>
         </w:rPr>
       </w:pPr>
-      <w:bookmarkStart w:id="8" w:name="_Student_outcomes_(learning"/>
-      <w:bookmarkEnd w:id="8"/>
+      <w:bookmarkStart w:id="7" w:name="_Student_outcomes_(learning"/>
+      <w:bookmarkEnd w:id="7"/>
       <w:r>
         <w:rPr>
           <w:rFonts w:asciiTheme="minorHAnsi" w:eastAsia="Times New Roman" w:hAnsiTheme="minorHAnsi"/>
@@ -5503,7 +5706,7 @@
     <w:p>
       <w:pPr>
         <w:pStyle w:val="Heading2"/>
-        <w:spacing w:before="120" w:beforeAutospacing="0" w:after="0" w:afterAutospacing="0" w:line="252" w:lineRule="auto"/>
+        <w:spacing w:before="120" w:beforeAutospacing="0" w:after="0" w:afterAutospacing="0"/>
         <w:rPr>
           <w:rFonts w:asciiTheme="minorHAnsi" w:hAnsiTheme="minorHAnsi"/>
           <w:color w:val="000000"/>
@@ -5524,7 +5727,7 @@
     <w:p>
       <w:pPr>
         <w:pStyle w:val="Heading2"/>
-        <w:spacing w:before="120" w:beforeAutospacing="0" w:after="0" w:afterAutospacing="0" w:line="252" w:lineRule="auto"/>
+        <w:spacing w:before="120" w:beforeAutospacing="0" w:after="0" w:afterAutospacing="0"/>
         <w:rPr>
           <w:rFonts w:asciiTheme="minorHAnsi" w:hAnsiTheme="minorHAnsi"/>
           <w:color w:val="000000"/>
@@ -5571,7 +5774,7 @@
           <w:ilvl w:val="0"/>
           <w:numId w:val="28"/>
         </w:numPr>
-        <w:spacing w:before="120" w:beforeAutospacing="0" w:after="0" w:afterAutospacing="0" w:line="252" w:lineRule="auto"/>
+        <w:spacing w:before="120" w:beforeAutospacing="0" w:after="0" w:afterAutospacing="0"/>
         <w:rPr>
           <w:rFonts w:asciiTheme="minorHAnsi" w:hAnsiTheme="minorHAnsi"/>
           <w:b w:val="0"/>
@@ -5599,7 +5802,7 @@
           <w:ilvl w:val="0"/>
           <w:numId w:val="28"/>
         </w:numPr>
-        <w:spacing w:before="120" w:beforeAutospacing="0" w:after="0" w:afterAutospacing="0" w:line="252" w:lineRule="auto"/>
+        <w:spacing w:before="120" w:beforeAutospacing="0" w:after="0" w:afterAutospacing="0"/>
         <w:rPr>
           <w:rFonts w:asciiTheme="minorHAnsi" w:hAnsiTheme="minorHAnsi"/>
           <w:b w:val="0"/>
@@ -5627,7 +5830,7 @@
           <w:ilvl w:val="0"/>
           <w:numId w:val="28"/>
         </w:numPr>
-        <w:spacing w:before="120" w:beforeAutospacing="0" w:after="0" w:afterAutospacing="0" w:line="252" w:lineRule="auto"/>
+        <w:spacing w:before="120" w:beforeAutospacing="0" w:after="0" w:afterAutospacing="0"/>
         <w:rPr>
           <w:rFonts w:asciiTheme="minorHAnsi" w:hAnsiTheme="minorHAnsi"/>
           <w:b w:val="0"/>
@@ -5655,7 +5858,7 @@
           <w:ilvl w:val="0"/>
           <w:numId w:val="28"/>
         </w:numPr>
-        <w:spacing w:before="120" w:beforeAutospacing="0" w:after="0" w:afterAutospacing="0" w:line="252" w:lineRule="auto"/>
+        <w:spacing w:before="120" w:beforeAutospacing="0" w:after="0" w:afterAutospacing="0"/>
         <w:rPr>
           <w:rFonts w:asciiTheme="minorHAnsi" w:hAnsiTheme="minorHAnsi"/>
           <w:b w:val="0"/>
@@ -5683,7 +5886,7 @@
           <w:ilvl w:val="0"/>
           <w:numId w:val="28"/>
         </w:numPr>
-        <w:spacing w:before="120" w:beforeAutospacing="0" w:after="0" w:afterAutospacing="0" w:line="252" w:lineRule="auto"/>
+        <w:spacing w:before="120" w:beforeAutospacing="0" w:after="0" w:afterAutospacing="0"/>
         <w:rPr>
           <w:rFonts w:asciiTheme="minorHAnsi" w:hAnsiTheme="minorHAnsi"/>
           <w:b w:val="0"/>
@@ -5711,7 +5914,7 @@
           <w:ilvl w:val="0"/>
           <w:numId w:val="28"/>
         </w:numPr>
-        <w:spacing w:before="120" w:beforeAutospacing="0" w:after="0" w:afterAutospacing="0" w:line="252" w:lineRule="auto"/>
+        <w:spacing w:before="120" w:beforeAutospacing="0" w:after="0" w:afterAutospacing="0"/>
         <w:rPr>
           <w:rFonts w:asciiTheme="minorHAnsi" w:hAnsiTheme="minorHAnsi"/>
           <w:b w:val="0"/>
@@ -5739,7 +5942,7 @@
           <w:ilvl w:val="0"/>
           <w:numId w:val="28"/>
         </w:numPr>
-        <w:spacing w:before="120" w:beforeAutospacing="0" w:after="0" w:afterAutospacing="0" w:line="252" w:lineRule="auto"/>
+        <w:spacing w:before="120" w:beforeAutospacing="0" w:after="0" w:afterAutospacing="0"/>
         <w:rPr>
           <w:rFonts w:asciiTheme="minorHAnsi" w:hAnsiTheme="minorHAnsi"/>
           <w:b w:val="0"/>
@@ -5757,7 +5960,6 @@
           <w:sz w:val="24"/>
           <w:szCs w:val="24"/>
         </w:rPr>
-        <w:lastRenderedPageBreak/>
         <w:t>Sequences and strings </w:t>
       </w:r>
     </w:p>
@@ -5768,7 +5970,7 @@
           <w:ilvl w:val="0"/>
           <w:numId w:val="28"/>
         </w:numPr>
-        <w:spacing w:before="120" w:beforeAutospacing="0" w:after="0" w:afterAutospacing="0" w:line="252" w:lineRule="auto"/>
+        <w:spacing w:before="120" w:beforeAutospacing="0" w:after="0" w:afterAutospacing="0"/>
         <w:rPr>
           <w:rFonts w:asciiTheme="minorHAnsi" w:hAnsiTheme="minorHAnsi"/>
           <w:b w:val="0"/>
@@ -5792,7 +5994,7 @@
     <w:p>
       <w:pPr>
         <w:pStyle w:val="Heading2"/>
-        <w:spacing w:before="120" w:beforeAutospacing="0" w:after="0" w:afterAutospacing="0" w:line="252" w:lineRule="auto"/>
+        <w:spacing w:before="120" w:beforeAutospacing="0" w:after="0" w:afterAutospacing="0"/>
         <w:rPr>
           <w:rStyle w:val="important"/>
           <w:rFonts w:asciiTheme="minorHAnsi" w:hAnsiTheme="minorHAnsi"/>
@@ -5810,6 +6012,7 @@
           <w:sz w:val="24"/>
           <w:szCs w:val="24"/>
         </w:rPr>
+        <w:lastRenderedPageBreak/>
         <w:t>Design, implement, debug and test small programs for solving problems motivated by real-world interests</w:t>
       </w:r>
       <w:r>
@@ -5902,7 +6105,7 @@
           <w:ilvl w:val="0"/>
           <w:numId w:val="38"/>
         </w:numPr>
-        <w:spacing w:before="120" w:beforeAutospacing="0" w:after="0" w:afterAutospacing="0" w:line="252" w:lineRule="auto"/>
+        <w:spacing w:before="120" w:beforeAutospacing="0" w:after="0" w:afterAutospacing="0"/>
         <w:rPr>
           <w:rFonts w:asciiTheme="minorHAnsi" w:hAnsiTheme="minorHAnsi"/>
           <w:b w:val="0"/>
@@ -5931,7 +6134,7 @@
           <w:ilvl w:val="0"/>
           <w:numId w:val="38"/>
         </w:numPr>
-        <w:spacing w:before="120" w:beforeAutospacing="0" w:after="0" w:afterAutospacing="0" w:line="252" w:lineRule="auto"/>
+        <w:spacing w:before="120" w:beforeAutospacing="0" w:after="0" w:afterAutospacing="0"/>
         <w:rPr>
           <w:rFonts w:asciiTheme="minorHAnsi" w:hAnsiTheme="minorHAnsi"/>
           <w:b w:val="0"/>
@@ -5960,7 +6163,7 @@
           <w:ilvl w:val="0"/>
           <w:numId w:val="38"/>
         </w:numPr>
-        <w:spacing w:before="120" w:beforeAutospacing="0" w:after="0" w:afterAutospacing="0" w:line="252" w:lineRule="auto"/>
+        <w:spacing w:before="120" w:beforeAutospacing="0" w:after="0" w:afterAutospacing="0"/>
         <w:rPr>
           <w:rFonts w:asciiTheme="minorHAnsi" w:hAnsiTheme="minorHAnsi"/>
           <w:b w:val="0"/>
@@ -5989,7 +6192,7 @@
           <w:ilvl w:val="0"/>
           <w:numId w:val="38"/>
         </w:numPr>
-        <w:spacing w:before="120" w:beforeAutospacing="0" w:after="0" w:afterAutospacing="0" w:line="252" w:lineRule="auto"/>
+        <w:spacing w:before="120" w:beforeAutospacing="0" w:after="0" w:afterAutospacing="0"/>
         <w:rPr>
           <w:rFonts w:asciiTheme="minorHAnsi" w:hAnsiTheme="minorHAnsi"/>
           <w:b w:val="0"/>
@@ -6018,7 +6221,7 @@
           <w:ilvl w:val="0"/>
           <w:numId w:val="38"/>
         </w:numPr>
-        <w:spacing w:before="120" w:beforeAutospacing="0" w:after="0" w:afterAutospacing="0" w:line="252" w:lineRule="auto"/>
+        <w:spacing w:before="120" w:beforeAutospacing="0" w:after="0" w:afterAutospacing="0"/>
         <w:rPr>
           <w:rFonts w:asciiTheme="minorHAnsi" w:hAnsiTheme="minorHAnsi"/>
           <w:b w:val="0"/>
@@ -6043,7 +6246,7 @@
     <w:p>
       <w:pPr>
         <w:pStyle w:val="Heading2"/>
-        <w:spacing w:before="120" w:beforeAutospacing="0" w:after="0" w:afterAutospacing="0" w:line="252" w:lineRule="auto"/>
+        <w:spacing w:before="120" w:beforeAutospacing="0" w:after="0" w:afterAutospacing="0"/>
         <w:ind w:left="360"/>
         <w:rPr>
           <w:rFonts w:asciiTheme="minorHAnsi" w:hAnsiTheme="minorHAnsi"/>
@@ -6072,7 +6275,7 @@
     </w:p>
     <w:p>
       <w:pPr>
-        <w:spacing w:before="120" w:line="252" w:lineRule="auto"/>
+        <w:spacing w:before="120"/>
         <w:rPr>
           <w:rFonts w:asciiTheme="minorHAnsi" w:hAnsiTheme="minorHAnsi"/>
           <w:color w:val="000000"/>
@@ -7202,7 +7405,7 @@
   <w:abstractNum w:abstractNumId="8" w15:restartNumberingAfterBreak="0">
     <w:nsid w:val="1949329D"/>
     <w:multiLevelType w:val="hybridMultilevel"/>
-    <w:tmpl w:val="7DCEA766"/>
+    <w:tmpl w:val="740EA522"/>
     <w:lvl w:ilvl="0" w:tplc="04090001">
       <w:start w:val="1"/>
       <w:numFmt w:val="bullet"/>
@@ -7227,7 +7430,7 @@
         <w:rFonts w:ascii="Courier New" w:hAnsi="Courier New" w:hint="default"/>
       </w:rPr>
     </w:lvl>
-    <w:lvl w:ilvl="2" w:tplc="04090005" w:tentative="1">
+    <w:lvl w:ilvl="2" w:tplc="04090005">
       <w:start w:val="1"/>
       <w:numFmt w:val="bullet"/>
       <w:lvlText w:val=""/>

</xml_diff>

<commit_message>
Added explicit instructions re academic integrity and using Generative AI or re-using materials from a previous term.  Modified the rule on snippets to allow for this.
</commit_message>
<xml_diff>
--- a/202630/Syllabus/Syllabus-202630.docx
+++ b/202630/Syllabus/Syllabus-202630.docx
@@ -1839,13 +1839,20 @@
         <w:contextualSpacing w:val="0"/>
         <w:rPr>
           <w:rFonts w:asciiTheme="minorHAnsi" w:hAnsiTheme="minorHAnsi"/>
+          <w:color w:val="000000"/>
+        </w:rPr>
+      </w:pPr>
+      <w:r>
+        <w:rPr>
+          <w:rFonts w:asciiTheme="minorHAnsi" w:hAnsiTheme="minorHAnsi"/>
           <w:b/>
           <w:bCs/>
           <w:i/>
           <w:iCs/>
           <w:color w:val="000000"/>
         </w:rPr>
-      </w:pPr>
+        <w:t xml:space="preserve">Small snippets of code (say, fewer than </w:t>
+      </w:r>
       <w:r>
         <w:rPr>
           <w:rFonts w:asciiTheme="minorHAnsi" w:hAnsiTheme="minorHAnsi"/>
@@ -1855,7 +1862,43 @@
           <w:iCs/>
           <w:color w:val="000000"/>
         </w:rPr>
-        <w:t>Small snippets of code (say, fewer than 10 or so lines of code) from any source.</w:t>
+        <w:t>6</w:t>
+      </w:r>
+      <w:r>
+        <w:rPr>
+          <w:rFonts w:asciiTheme="minorHAnsi" w:hAnsiTheme="minorHAnsi"/>
+          <w:b/>
+          <w:bCs/>
+          <w:i/>
+          <w:iCs/>
+          <w:color w:val="000000"/>
+        </w:rPr>
+        <w:t xml:space="preserve"> or so lines of code) from any source</w:t>
+      </w:r>
+      <w:r>
+        <w:rPr>
+          <w:rFonts w:asciiTheme="minorHAnsi" w:hAnsiTheme="minorHAnsi"/>
+          <w:b/>
+          <w:bCs/>
+          <w:i/>
+          <w:iCs/>
+          <w:color w:val="000000"/>
+        </w:rPr>
+        <w:t xml:space="preserve"> </w:t>
+      </w:r>
+      <w:r>
+        <w:rPr>
+          <w:rFonts w:asciiTheme="minorHAnsi" w:hAnsiTheme="minorHAnsi"/>
+          <w:color w:val="000000"/>
+        </w:rPr>
+        <w:t>except Generative AI (see Rule 4 below)</w:t>
+      </w:r>
+      <w:r>
+        <w:rPr>
+          <w:rFonts w:asciiTheme="minorHAnsi" w:hAnsiTheme="minorHAnsi"/>
+          <w:color w:val="000000"/>
+        </w:rPr>
+        <w:t>.</w:t>
       </w:r>
     </w:p>
     <w:p>
@@ -2150,16 +2193,7 @@
           <w:bCs/>
           <w:color w:val="000000"/>
         </w:rPr>
-        <w:t>You</w:t>
-      </w:r>
-      <w:r>
-        <w:rPr>
-          <w:rFonts w:asciiTheme="minorHAnsi" w:hAnsiTheme="minorHAnsi"/>
-          <w:b/>
-          <w:bCs/>
-          <w:color w:val="000000"/>
-        </w:rPr>
-        <w:t xml:space="preserve"> are NOT permitted to use these</w:t>
+        <w:t>You are NOT permitted to use these</w:t>
       </w:r>
       <w:r>
         <w:rPr>
@@ -2525,36 +2559,8 @@
         </w:rPr>
         <w:t>Come talk to us instead.</w:t>
       </w:r>
-    </w:p>
-    <w:p>
-      <w:pPr>
-        <w:rPr>
-          <w:rFonts w:asciiTheme="minorHAnsi" w:hAnsiTheme="minorHAnsi" w:cstheme="majorBidi"/>
-          <w:b/>
-          <w:bCs/>
-          <w:i/>
-          <w:iCs/>
-          <w:color w:val="2F5496" w:themeColor="accent1" w:themeShade="BF"/>
-          <w:sz w:val="40"/>
-          <w:szCs w:val="40"/>
-          <w:highlight w:val="yellow"/>
-        </w:rPr>
-      </w:pPr>
       <w:bookmarkStart w:id="4" w:name="_Assessment_(how_you"/>
       <w:bookmarkEnd w:id="4"/>
-      <w:r>
-        <w:rPr>
-          <w:rFonts w:asciiTheme="minorHAnsi" w:hAnsiTheme="minorHAnsi"/>
-          <w:b/>
-          <w:bCs/>
-          <w:i/>
-          <w:iCs/>
-          <w:sz w:val="40"/>
-          <w:szCs w:val="40"/>
-          <w:highlight w:val="yellow"/>
-        </w:rPr>
-        <w:br w:type="page"/>
-      </w:r>
     </w:p>
     <w:p>
       <w:pPr>
@@ -3674,28 +3680,16 @@
     </w:p>
     <w:p>
       <w:pPr>
-        <w:spacing w:before="120"/>
-        <w:rPr>
-          <w:rFonts w:ascii="MS Gothic" w:eastAsia="MS Gothic" w:hAnsi="MS Gothic" w:cs="MS Gothic"/>
-          <w:color w:val="000000"/>
-        </w:rPr>
-      </w:pPr>
-    </w:p>
-    <w:p>
-      <w:pPr>
-        <w:spacing w:before="120"/>
-        <w:rPr>
-          <w:rFonts w:ascii="MS Gothic" w:eastAsia="MS Gothic" w:hAnsi="MS Gothic" w:cs="MS Gothic"/>
-          <w:color w:val="000000"/>
-        </w:rPr>
-      </w:pPr>
-    </w:p>
-    <w:p>
-      <w:pPr>
-        <w:spacing w:before="120"/>
-        <w:rPr>
-          <w:rFonts w:asciiTheme="minorHAnsi" w:hAnsiTheme="minorHAnsi"/>
-          <w:color w:val="000000"/>
+        <w:rPr>
+          <w:rFonts w:asciiTheme="minorHAnsi" w:hAnsiTheme="minorHAnsi" w:cstheme="majorBidi"/>
+          <w:b/>
+          <w:bCs/>
+          <w:i/>
+          <w:iCs/>
+          <w:color w:val="2F5496" w:themeColor="accent1" w:themeShade="BF"/>
+          <w:sz w:val="40"/>
+          <w:szCs w:val="40"/>
+          <w:highlight w:val="yellow"/>
         </w:rPr>
       </w:pPr>
     </w:p>
@@ -4281,45 +4275,50 @@
           <w:rFonts w:asciiTheme="minorHAnsi" w:hAnsiTheme="minorHAnsi"/>
           <w:color w:val="364451"/>
         </w:rPr>
-        <w:t xml:space="preserve"> Union.  We are open  </w:t>
-      </w:r>
-      <w:r>
-        <w:rPr>
-          <w:rFonts w:asciiTheme="minorHAnsi" w:hAnsiTheme="minorHAnsi"/>
-          <w:b/>
-          <w:bCs/>
-        </w:rPr>
-        <w:t>Monday-Friday  8AM-5PM.</w:t>
-      </w:r>
-    </w:p>
-    <w:p>
-      <w:pPr>
-        <w:spacing w:before="120"/>
+        <w:t xml:space="preserve"> Union.  We are </w:t>
+      </w:r>
+      <w:proofErr w:type="gramStart"/>
+      <w:r>
         <w:rPr>
           <w:rFonts w:asciiTheme="minorHAnsi" w:hAnsiTheme="minorHAnsi"/>
           <w:color w:val="364451"/>
         </w:rPr>
-      </w:pPr>
-    </w:p>
-    <w:p>
-      <w:pPr>
-        <w:rPr>
-          <w:rFonts w:ascii="Verdana" w:hAnsi="Verdana"/>
-          <w:b/>
-          <w:bCs/>
-          <w:color w:val="000000"/>
-          <w:sz w:val="29"/>
-          <w:szCs w:val="29"/>
-        </w:rPr>
-      </w:pPr>
-      <w:r>
-        <w:rPr>
-          <w:rFonts w:ascii="Verdana" w:hAnsi="Verdana"/>
-          <w:color w:val="000000"/>
-          <w:sz w:val="29"/>
-          <w:szCs w:val="29"/>
-        </w:rPr>
-        <w:br w:type="page"/>
+        <w:t>open  </w:t>
+      </w:r>
+      <w:r>
+        <w:rPr>
+          <w:rFonts w:asciiTheme="minorHAnsi" w:hAnsiTheme="minorHAnsi"/>
+          <w:b/>
+          <w:bCs/>
+        </w:rPr>
+        <w:t>Monday</w:t>
+      </w:r>
+      <w:proofErr w:type="gramEnd"/>
+      <w:r>
+        <w:rPr>
+          <w:rFonts w:asciiTheme="minorHAnsi" w:hAnsiTheme="minorHAnsi"/>
+          <w:b/>
+          <w:bCs/>
+        </w:rPr>
+        <w:t>-</w:t>
+      </w:r>
+      <w:proofErr w:type="gramStart"/>
+      <w:r>
+        <w:rPr>
+          <w:rFonts w:asciiTheme="minorHAnsi" w:hAnsiTheme="minorHAnsi"/>
+          <w:b/>
+          <w:bCs/>
+        </w:rPr>
+        <w:t>Friday  8</w:t>
+      </w:r>
+      <w:proofErr w:type="gramEnd"/>
+      <w:r>
+        <w:rPr>
+          <w:rFonts w:asciiTheme="minorHAnsi" w:hAnsiTheme="minorHAnsi"/>
+          <w:b/>
+          <w:bCs/>
+        </w:rPr>
+        <w:t>AM-5PM.</w:t>
       </w:r>
     </w:p>
     <w:p>

</xml_diff>

<commit_message>
Clarified LLM usage instructions.
</commit_message>
<xml_diff>
--- a/202630/Syllabus/Syllabus-202630.docx
+++ b/202630/Syllabus/Syllabus-202630.docx
@@ -134,7 +134,7 @@
           <w:color w:val="000000"/>
         </w:rPr>
       </w:pPr>
-      <w:hyperlink w:anchor="_Catalog_Description" w:history="1">
+      <w:hyperlink w:anchor="__Assessment_(how_you" w:history="1">
         <w:r>
           <w:rPr>
             <w:rStyle w:val="Hyperlink"/>
@@ -174,7 +174,7 @@
         </w:rPr>
         <w:t xml:space="preserve">      </w:t>
       </w:r>
-      <w:hyperlink w:anchor="_Academic_Integrity" w:history="1">
+      <w:hyperlink w:anchor="_Academic_Integrity_(and" w:history="1">
         <w:r>
           <w:rPr>
             <w:rStyle w:val="Hyperlink"/>
@@ -194,7 +194,7 @@
         </w:rPr>
         <w:t xml:space="preserve">     </w:t>
       </w:r>
-      <w:hyperlink w:anchor="__Assessment_(how_you" w:history="1">
+      <w:hyperlink w:anchor="_Assessment_(how_you_1" w:history="1">
         <w:r>
           <w:rPr>
             <w:rStyle w:val="Hyperlink"/>
@@ -220,7 +220,7 @@
           <w:color w:val="000000"/>
         </w:rPr>
       </w:pPr>
-      <w:hyperlink w:anchor="__Making_our_classroom" w:history="1">
+      <w:hyperlink w:anchor="_Making_our_classroom" w:history="1">
         <w:r>
           <w:rPr>
             <w:rStyle w:val="Hyperlink"/>
@@ -260,7 +260,7 @@
         </w:rPr>
         <w:t xml:space="preserve">     </w:t>
       </w:r>
-      <w:hyperlink w:anchor="_Student_outcomes_(learning" w:history="1">
+      <w:hyperlink w:anchor="_Student_outcomes_(learning_1" w:history="1">
         <w:r>
           <w:rPr>
             <w:rStyle w:val="Hyperlink"/>
@@ -683,6 +683,8 @@
           <w:highlight w:val="yellow"/>
         </w:rPr>
       </w:pPr>
+      <w:bookmarkStart w:id="4" w:name="_Academic_Integrity_(and"/>
+      <w:bookmarkEnd w:id="4"/>
       <w:r>
         <w:rPr>
           <w:rFonts w:asciiTheme="minorHAnsi" w:eastAsia="Times New Roman" w:hAnsiTheme="minorHAnsi"/>
@@ -2330,7 +2332,28 @@
           <w:rFonts w:asciiTheme="minorHAnsi" w:hAnsiTheme="minorHAnsi"/>
           <w:color w:val="000000"/>
         </w:rPr>
-        <w:t>Asking an AI for advice on something that does not cause the AI to generate code / program design.</w:t>
+        <w:t>Asking an AI for advice on something that does not cause the AI to generate code / program design</w:t>
+      </w:r>
+      <w:r>
+        <w:rPr>
+          <w:rFonts w:asciiTheme="minorHAnsi" w:hAnsiTheme="minorHAnsi"/>
+          <w:color w:val="000000"/>
+        </w:rPr>
+        <w:t>.  (If the query does generate example code, ignore it</w:t>
+      </w:r>
+      <w:r>
+        <w:rPr>
+          <w:rFonts w:asciiTheme="minorHAnsi" w:hAnsiTheme="minorHAnsi"/>
+          <w:color w:val="000000"/>
+        </w:rPr>
+        <w:t>.</w:t>
+      </w:r>
+      <w:r>
+        <w:rPr>
+          <w:rFonts w:asciiTheme="minorHAnsi" w:hAnsiTheme="minorHAnsi"/>
+          <w:color w:val="000000"/>
+        </w:rPr>
+        <w:t>)</w:t>
       </w:r>
     </w:p>
     <w:p>
@@ -2573,8 +2596,8 @@
         </w:rPr>
         <w:t>Come talk to us instead.</w:t>
       </w:r>
-      <w:bookmarkStart w:id="4" w:name="_Assessment_(how_you"/>
-      <w:bookmarkEnd w:id="4"/>
+      <w:bookmarkStart w:id="5" w:name="_Assessment_(how_you"/>
+      <w:bookmarkEnd w:id="5"/>
     </w:p>
     <w:p>
       <w:pPr>
@@ -2591,6 +2614,8 @@
           <w:highlight w:val="yellow"/>
         </w:rPr>
       </w:pPr>
+      <w:bookmarkStart w:id="6" w:name="_Assessment_(how_you_1"/>
+      <w:bookmarkEnd w:id="6"/>
       <w:r>
         <w:rPr>
           <w:rFonts w:asciiTheme="minorHAnsi" w:eastAsia="Times New Roman" w:hAnsiTheme="minorHAnsi"/>
@@ -3710,19 +3735,6 @@
     <w:p>
       <w:pPr>
         <w:rPr>
-          <w:rFonts w:asciiTheme="minorHAnsi" w:hAnsiTheme="minorHAnsi" w:cstheme="majorBidi"/>
-          <w:b/>
-          <w:bCs/>
-          <w:i/>
-          <w:iCs/>
-          <w:color w:val="2F5496" w:themeColor="accent1" w:themeShade="BF"/>
-          <w:sz w:val="40"/>
-          <w:szCs w:val="40"/>
-          <w:highlight w:val="yellow"/>
-        </w:rPr>
-      </w:pPr>
-      <w:r>
-        <w:rPr>
           <w:rFonts w:asciiTheme="minorHAnsi" w:hAnsiTheme="minorHAnsi"/>
           <w:b/>
           <w:bCs/>
@@ -3732,15 +3744,10 @@
           <w:szCs w:val="40"/>
           <w:highlight w:val="yellow"/>
         </w:rPr>
-        <w:br w:type="page"/>
-      </w:r>
-    </w:p>
-    <w:p>
-      <w:pPr>
-        <w:pStyle w:val="Heading1"/>
-        <w:spacing w:before="120"/>
-        <w:rPr>
-          <w:rFonts w:asciiTheme="minorHAnsi" w:eastAsia="Times New Roman" w:hAnsiTheme="minorHAnsi"/>
+      </w:pPr>
+      <w:r>
+        <w:rPr>
+          <w:rFonts w:asciiTheme="minorHAnsi" w:hAnsiTheme="minorHAnsi"/>
           <w:b/>
           <w:bCs/>
           <w:i/>
@@ -3749,10 +3756,11 @@
           <w:szCs w:val="40"/>
           <w:highlight w:val="yellow"/>
         </w:rPr>
-      </w:pPr>
-      <w:r>
-        <w:rPr>
-          <w:rFonts w:asciiTheme="minorHAnsi" w:eastAsia="Times New Roman" w:hAnsiTheme="minorHAnsi"/>
+        <w:br w:type="page"/>
+      </w:r>
+      <w:r>
+        <w:rPr>
+          <w:rFonts w:asciiTheme="minorHAnsi" w:hAnsiTheme="minorHAnsi"/>
           <w:b/>
           <w:bCs/>
           <w:i/>
@@ -4349,8 +4357,8 @@
           <w:szCs w:val="40"/>
         </w:rPr>
       </w:pPr>
-      <w:bookmarkStart w:id="5" w:name="_Making_our_classroom"/>
-      <w:bookmarkEnd w:id="5"/>
+      <w:bookmarkStart w:id="7" w:name="_Making_our_classroom"/>
+      <w:bookmarkEnd w:id="7"/>
       <w:r>
         <w:rPr>
           <w:rFonts w:asciiTheme="minorHAnsi" w:eastAsia="Times New Roman" w:hAnsiTheme="minorHAnsi"/>
@@ -5377,8 +5385,8 @@
           <w:szCs w:val="40"/>
         </w:rPr>
       </w:pPr>
-      <w:bookmarkStart w:id="6" w:name="_Attendance_and_Late"/>
-      <w:bookmarkEnd w:id="6"/>
+      <w:bookmarkStart w:id="8" w:name="_Attendance_and_Late"/>
+      <w:bookmarkEnd w:id="8"/>
       <w:r>
         <w:rPr>
           <w:rFonts w:asciiTheme="minorHAnsi" w:eastAsia="Times New Roman" w:hAnsiTheme="minorHAnsi"/>
@@ -5662,15 +5670,41 @@
         </w:rPr>
         <w:t xml:space="preserve"> you do complete the work by whatever day you and your instructor agree upon, you get full credit for it.</w:t>
       </w:r>
+      <w:bookmarkStart w:id="9" w:name="_Student_outcomes_(learning"/>
+      <w:bookmarkStart w:id="10" w:name="_Student_outcomes_(learning_1"/>
+      <w:bookmarkEnd w:id="9"/>
+      <w:bookmarkEnd w:id="10"/>
     </w:p>
     <w:p>
       <w:pPr>
         <w:spacing w:before="120"/>
         <w:rPr>
           <w:rFonts w:asciiTheme="minorHAnsi" w:hAnsiTheme="minorHAnsi"/>
-          <w:color w:val="364451"/>
-        </w:rPr>
-      </w:pPr>
+          <w:b/>
+          <w:bCs/>
+          <w:color w:val="000000"/>
+        </w:rPr>
+      </w:pPr>
+    </w:p>
+    <w:p>
+      <w:pPr>
+        <w:spacing w:before="120"/>
+        <w:rPr>
+          <w:rFonts w:asciiTheme="minorHAnsi" w:hAnsiTheme="minorHAnsi"/>
+          <w:b/>
+          <w:bCs/>
+          <w:color w:val="000000"/>
+        </w:rPr>
+      </w:pPr>
+      <w:r>
+        <w:rPr>
+          <w:rFonts w:asciiTheme="minorHAnsi" w:hAnsiTheme="minorHAnsi"/>
+          <w:b/>
+          <w:bCs/>
+          <w:color w:val="000000"/>
+        </w:rPr>
+        <w:br w:type="page"/>
+      </w:r>
     </w:p>
     <w:p>
       <w:pPr>
@@ -5687,8 +5721,6 @@
           <w:highlight w:val="yellow"/>
         </w:rPr>
       </w:pPr>
-      <w:bookmarkStart w:id="7" w:name="_Student_outcomes_(learning"/>
-      <w:bookmarkEnd w:id="7"/>
       <w:r>
         <w:rPr>
           <w:rFonts w:asciiTheme="minorHAnsi" w:eastAsia="Times New Roman" w:hAnsiTheme="minorHAnsi"/>
@@ -5700,6 +5732,7 @@
           <w:szCs w:val="40"/>
           <w:highlight w:val="yellow"/>
         </w:rPr>
+        <w:lastRenderedPageBreak/>
         <w:t>Student outcomes (learning objectives)</w:t>
       </w:r>
       <w:r>
@@ -6025,7 +6058,6 @@
           <w:sz w:val="24"/>
           <w:szCs w:val="24"/>
         </w:rPr>
-        <w:lastRenderedPageBreak/>
         <w:t>Design, implement, debug and test small programs for solving problems motivated by real-world interests</w:t>
       </w:r>
       <w:r>

</xml_diff>